<commit_message>
Letter re-dated 19 October 2026; item 1 tightened
- Letter, schedule heading and enclosure line now 19 October 2026 (builder default changed).
- Item 1: the facts, not admitted on 8 Sep, record register entries; the same entries appear in the
  spreadsheet provided on 12 Oct (replaces the doubled "records entries" wording).
- Cover email renamed for sending on 19 Oct and its attachment name re-dated; README order of sending updated.

Co-Authored-By: Claude Opus 5.5 <noreply@anthropic.com>
Claude-Session: https://claude.ai/code/session_01P17mt65P6No5vkc3DV9xfU
</commit_message>
<xml_diff>
--- a/wc2024227/drafts/out/PRECONF_22OCT2026/LETTER_TO_REGULATOR_with_updated_Schedule_DRAFT.docx
+++ b/wc2024227/drafts/out/PRECONF_22OCT2026/LETTER_TO_REGULATOR_with_updated_Schedule_DRAFT.docx
@@ -14,7 +14,7 @@
           <w:sz w:val="22"/>
           <w:szCs w:val="22"/>
         </w:rPr>
-        <w:t xml:space="preserve">22 October 2026</w:t>
+        <w:t xml:space="preserve">19 October 2026</w:t>
       </w:r>
     </w:p>
     <w:p>
@@ -191,7 +191,7 @@
           <w:sz w:val="22"/>
           <w:szCs w:val="22"/>
         </w:rPr>
-        <w:t xml:space="preserve"> With those confirmations, 38 of the 39 documents at Annexure A to the notices to admit served on 28 August 2026 are admitted or confirmed; Tab 24 is the only one outstanding. The Schedule to my letter of 1 October 2026 is enclosed, updated to 22 October 2026. Part 1 shows the position of each document, and two short tables follow it: the documents at Tab 32, and the entries in the spreadsheet you provided on 12 October 2026 that facts 228 to 231 record. Parts 2 and 3 are unchanged.</w:t>
+        <w:t xml:space="preserve"> With those confirmations, 38 of the 39 documents at Annexure A to the notices to admit served on 28 August 2026 are admitted or confirmed; Tab 24 is the only one outstanding. The Schedule to my letter of 1 October 2026 is enclosed, updated to 19 October 2026. Part 1 shows the position of each document, and two short tables follow it: the documents at Tab 32, and the entries in the spreadsheet you provided on 12 October 2026 that facts 228 to 231 record. Parts 2 and 3 are unchanged.</w:t>
       </w:r>
     </w:p>
     <w:p>
@@ -245,7 +245,7 @@
           <w:sz w:val="22"/>
           <w:szCs w:val="22"/>
         </w:rPr>
-        <w:t xml:space="preserve"> These facts record entries in the Emergency Code Register for 17, 18 and 19 March 2024 and were not admitted on 8 September 2026. Each of them records entries in the spreadsheet "2024 Emergency Code Register_16 to 20 March 2024.xlsx" that you provided on 12 October 2026 and whose veracity the Respondent has confirmed; the table after Part 1 of the Schedule identifies those entries by row. Now that the spreadsheet is confirmed, does the Respondent admit facts 228 to 231?</w:t>
+        <w:t xml:space="preserve"> These facts, which were not admitted on 8 September 2026, record entries in the Emergency Code Register for 17, 18 and 19 March 2024. The same entries appear in the spreadsheet "2024 Emergency Code Register_16 to 20 March 2024.xlsx" that you provided on 12 October 2026 and whose veracity the Respondent has confirmed; the table after Part 1 of the Schedule identifies them by row. Now that the spreadsheet is confirmed, does the Respondent admit facts 228 to 231?</w:t>
       </w:r>
     </w:p>
     <w:p>
@@ -504,7 +504,7 @@
           <w:sz w:val="22"/>
           <w:szCs w:val="22"/>
         </w:rPr>
-        <w:t xml:space="preserve">Enclosure: Schedule to the Appellant's letter of 1 October 2026, updated to 22 October 2026 (Parts 1 to 3).</w:t>
+        <w:t xml:space="preserve">Enclosure: Schedule to the Appellant's letter of 1 October 2026, updated to 19 October 2026 (Parts 1 to 3).</w:t>
       </w:r>
     </w:p>
     <w:p>
@@ -524,7 +524,7 @@
           <w:sz w:val="22"/>
           <w:szCs w:val="22"/>
         </w:rPr>
-        <w:t xml:space="preserve">WC/2024/227 - Schedule to the Appellant's letter of 1 October 2026, updated to 22 October 2026</w:t>
+        <w:t xml:space="preserve">WC/2024/227 - Schedule to the Appellant's letter of 1 October 2026, updated to 19 October 2026</w:t>
       </w:r>
     </w:p>
     <w:p>

</xml_diff>

<commit_message>
Schedule: "Veracity confirmed; tender proposed"; letter item 4 accepts de novo
- Position now: "Admitted; tender proposed" for the 25 admitted on 8 Sep; "Veracity confirmed; tender
  proposed" for the twelve the Respondent confirmed on 24 Sep and 12 Oct (its own word), replacing
  "Now admitted; tender"; Tab 31 and the Tab 32 table follow suit. No agreement to tender or concession
  on admissibility is implied.
- Letter item 4: the Appellant accepts the hearing is de novo and no finding binds the Commission (as
  9A Part C para 9 already says); the question is only whether the s 32(1) elements can be agreed.
- Part 1 column widths rebalanced to keep the package at 10 pages; reproduced cells re-verified (0 diffs).

Co-Authored-By: Claude Opus 5.5 <noreply@anthropic.com>
Claude-Session: https://claude.ai/code/session_01P17mt65P6No5vkc3DV9xfU
</commit_message>
<xml_diff>
--- a/wc2024227/drafts/out/PRECONF_22OCT2026/LETTER_TO_REGULATOR_with_updated_Schedule_DRAFT.docx
+++ b/wc2024227/drafts/out/PRECONF_22OCT2026/LETTER_TO_REGULATOR_with_updated_Schedule_DRAFT.docx
@@ -341,7 +341,7 @@
           <w:sz w:val="22"/>
           <w:szCs w:val="22"/>
         </w:rPr>
-        <w:t xml:space="preserve"> Review Decision 69983 states, under the heading "Conclusion", that the Appellant "sustained a personal injury of a psychological nature" and that the "injury arose out of employment, to the extent that it arose out of factors 2, 3 and 4, where employment was a significant contributing factor" (facts 261 and 262, admitted); the claim was rejected under section 32(5) of the Act. Does the Respondent agree that, to that extent, the elements of section 32(1) are not in issue, so that the issue for any hearing is confined to section 32(5)?</w:t>
+        <w:t xml:space="preserve"> Review Decision 69983 states, under the heading "Conclusion", that the Appellant "sustained a personal injury of a psychological nature" and that the "injury arose out of employment, to the extent that it arose out of factors 2, 3 and 4, where employment was a significant contributing factor" (facts 261 and 262, admitted); the claim was rejected under section 32(5) of the Act. The Appellant accepts that the hearing is de novo and that no finding in the decision binds the Commission; the question is whether these matters can be agreed. Does the Respondent agree that, to that extent, the elements of section 32(1) are not in issue, so that the issue for any hearing is confined to section 32(5)?</w:t>
       </w:r>
     </w:p>
     <w:p>
@@ -590,12 +590,12 @@
       </w:tblPr>
       <w:tblGrid>
         <w:gridCol w:w="560"/>
-        <w:gridCol w:w="2400"/>
+        <w:gridCol w:w="2340"/>
         <w:gridCol w:w="1200"/>
         <w:gridCol w:w="1000"/>
-        <w:gridCol w:w="1560"/>
-        <w:gridCol w:w="1440"/>
-        <w:gridCol w:w="1478"/>
+        <w:gridCol w:w="1540"/>
+        <w:gridCol w:w="1300"/>
+        <w:gridCol w:w="1698"/>
       </w:tblGrid>
       <w:tr>
         <w:trPr>
@@ -639,7 +639,7 @@
         </w:tc>
         <w:tc>
           <w:tcPr>
-            <w:tcW w:type="dxa" w:w="2400"/>
+            <w:tcW w:type="dxa" w:w="2340"/>
             <w:tcBorders>
               <w:top w:val="single" w:color="D9D9D9" w:sz="4"/>
               <w:left w:val="single" w:color="D9D9D9" w:sz="4"/>
@@ -744,7 +744,7 @@
         </w:tc>
         <w:tc>
           <w:tcPr>
-            <w:tcW w:type="dxa" w:w="1560"/>
+            <w:tcW w:type="dxa" w:w="1540"/>
             <w:tcBorders>
               <w:top w:val="single" w:color="D9D9D9" w:sz="4"/>
               <w:left w:val="single" w:color="D9D9D9" w:sz="4"/>
@@ -779,7 +779,7 @@
         </w:tc>
         <w:tc>
           <w:tcPr>
-            <w:tcW w:type="dxa" w:w="1440"/>
+            <w:tcW w:type="dxa" w:w="1300"/>
             <w:tcBorders>
               <w:top w:val="single" w:color="D9D9D9" w:sz="4"/>
               <w:left w:val="single" w:color="D9D9D9" w:sz="4"/>
@@ -814,7 +814,7 @@
         </w:tc>
         <w:tc>
           <w:tcPr>
-            <w:tcW w:type="dxa" w:w="1478"/>
+            <w:tcW w:type="dxa" w:w="1698"/>
             <w:tcBorders>
               <w:top w:val="single" w:color="D9D9D9" w:sz="4"/>
               <w:left w:val="single" w:color="D9D9D9" w:sz="4"/>
@@ -886,7 +886,7 @@
         </w:tc>
         <w:tc>
           <w:tcPr>
-            <w:tcW w:type="dxa" w:w="2400"/>
+            <w:tcW w:type="dxa" w:w="2340"/>
             <w:tcBorders>
               <w:top w:val="single" w:color="D9D9D9" w:sz="4"/>
               <w:left w:val="single" w:color="D9D9D9" w:sz="4"/>
@@ -979,7 +979,7 @@
         </w:tc>
         <w:tc>
           <w:tcPr>
-            <w:tcW w:type="dxa" w:w="1560"/>
+            <w:tcW w:type="dxa" w:w="1540"/>
             <w:tcBorders>
               <w:top w:val="single" w:color="D9D9D9" w:sz="4"/>
               <w:left w:val="single" w:color="D9D9D9" w:sz="4"/>
@@ -1010,7 +1010,7 @@
         </w:tc>
         <w:tc>
           <w:tcPr>
-            <w:tcW w:type="dxa" w:w="1440"/>
+            <w:tcW w:type="dxa" w:w="1300"/>
             <w:tcBorders>
               <w:top w:val="single" w:color="D9D9D9" w:sz="4"/>
               <w:left w:val="single" w:color="D9D9D9" w:sz="4"/>
@@ -1041,32 +1041,32 @@
         </w:tc>
         <w:tc>
           <w:tcPr>
-            <w:tcW w:type="dxa" w:w="1478"/>
-            <w:tcBorders>
-              <w:top w:val="single" w:color="D9D9D9" w:sz="4"/>
-              <w:left w:val="single" w:color="D9D9D9" w:sz="4"/>
-              <w:bottom w:val="single" w:color="D9D9D9" w:sz="4"/>
-              <w:right w:val="single" w:color="D9D9D9" w:sz="4"/>
-            </w:tcBorders>
-            <w:tcMar>
-              <w:top w:type="dxa" w:w="70"/>
-              <w:left w:type="dxa" w:w="80"/>
-              <w:bottom w:type="dxa" w:w="70"/>
-              <w:right w:type="dxa" w:w="80"/>
-            </w:tcMar>
-          </w:tcPr>
-          <w:p>
-            <w:pPr>
-              <w:keepNext w:val="false"/>
-              <w:spacing w:after="0" w:line="240"/>
-            </w:pPr>
-            <w:r>
-              <w:rPr>
-                <w:rFonts w:ascii="Times New Roman" w:cs="Times New Roman" w:eastAsia="Times New Roman" w:hAnsi="Times New Roman"/>
-                <w:sz w:val="22"/>
-                <w:szCs w:val="22"/>
-              </w:rPr>
-              <w:t xml:space="preserve">Admitted; tender</w:t>
+            <w:tcW w:type="dxa" w:w="1698"/>
+            <w:tcBorders>
+              <w:top w:val="single" w:color="D9D9D9" w:sz="4"/>
+              <w:left w:val="single" w:color="D9D9D9" w:sz="4"/>
+              <w:bottom w:val="single" w:color="D9D9D9" w:sz="4"/>
+              <w:right w:val="single" w:color="D9D9D9" w:sz="4"/>
+            </w:tcBorders>
+            <w:tcMar>
+              <w:top w:type="dxa" w:w="70"/>
+              <w:left w:type="dxa" w:w="80"/>
+              <w:bottom w:type="dxa" w:w="70"/>
+              <w:right w:type="dxa" w:w="80"/>
+            </w:tcMar>
+          </w:tcPr>
+          <w:p>
+            <w:pPr>
+              <w:keepNext w:val="false"/>
+              <w:spacing w:after="0" w:line="240"/>
+            </w:pPr>
+            <w:r>
+              <w:rPr>
+                <w:rFonts w:ascii="Times New Roman" w:cs="Times New Roman" w:eastAsia="Times New Roman" w:hAnsi="Times New Roman"/>
+                <w:sz w:val="22"/>
+                <w:szCs w:val="22"/>
+              </w:rPr>
+              <w:t xml:space="preserve">Admitted; tender proposed</w:t>
             </w:r>
           </w:p>
         </w:tc>
@@ -1109,7 +1109,7 @@
         </w:tc>
         <w:tc>
           <w:tcPr>
-            <w:tcW w:type="dxa" w:w="2400"/>
+            <w:tcW w:type="dxa" w:w="2340"/>
             <w:tcBorders>
               <w:top w:val="single" w:color="D9D9D9" w:sz="4"/>
               <w:left w:val="single" w:color="D9D9D9" w:sz="4"/>
@@ -1202,7 +1202,7 @@
         </w:tc>
         <w:tc>
           <w:tcPr>
-            <w:tcW w:type="dxa" w:w="1560"/>
+            <w:tcW w:type="dxa" w:w="1540"/>
             <w:tcBorders>
               <w:top w:val="single" w:color="D9D9D9" w:sz="4"/>
               <w:left w:val="single" w:color="D9D9D9" w:sz="4"/>
@@ -1233,7 +1233,7 @@
         </w:tc>
         <w:tc>
           <w:tcPr>
-            <w:tcW w:type="dxa" w:w="1440"/>
+            <w:tcW w:type="dxa" w:w="1300"/>
             <w:tcBorders>
               <w:top w:val="single" w:color="D9D9D9" w:sz="4"/>
               <w:left w:val="single" w:color="D9D9D9" w:sz="4"/>
@@ -1264,32 +1264,32 @@
         </w:tc>
         <w:tc>
           <w:tcPr>
-            <w:tcW w:type="dxa" w:w="1478"/>
-            <w:tcBorders>
-              <w:top w:val="single" w:color="D9D9D9" w:sz="4"/>
-              <w:left w:val="single" w:color="D9D9D9" w:sz="4"/>
-              <w:bottom w:val="single" w:color="D9D9D9" w:sz="4"/>
-              <w:right w:val="single" w:color="D9D9D9" w:sz="4"/>
-            </w:tcBorders>
-            <w:tcMar>
-              <w:top w:type="dxa" w:w="70"/>
-              <w:left w:type="dxa" w:w="80"/>
-              <w:bottom w:type="dxa" w:w="70"/>
-              <w:right w:type="dxa" w:w="80"/>
-            </w:tcMar>
-          </w:tcPr>
-          <w:p>
-            <w:pPr>
-              <w:keepNext w:val="false"/>
-              <w:spacing w:after="0" w:line="240"/>
-            </w:pPr>
-            <w:r>
-              <w:rPr>
-                <w:rFonts w:ascii="Times New Roman" w:cs="Times New Roman" w:eastAsia="Times New Roman" w:hAnsi="Times New Roman"/>
-                <w:sz w:val="22"/>
-                <w:szCs w:val="22"/>
-              </w:rPr>
-              <w:t xml:space="preserve">Admitted; tender</w:t>
+            <w:tcW w:type="dxa" w:w="1698"/>
+            <w:tcBorders>
+              <w:top w:val="single" w:color="D9D9D9" w:sz="4"/>
+              <w:left w:val="single" w:color="D9D9D9" w:sz="4"/>
+              <w:bottom w:val="single" w:color="D9D9D9" w:sz="4"/>
+              <w:right w:val="single" w:color="D9D9D9" w:sz="4"/>
+            </w:tcBorders>
+            <w:tcMar>
+              <w:top w:type="dxa" w:w="70"/>
+              <w:left w:type="dxa" w:w="80"/>
+              <w:bottom w:type="dxa" w:w="70"/>
+              <w:right w:type="dxa" w:w="80"/>
+            </w:tcMar>
+          </w:tcPr>
+          <w:p>
+            <w:pPr>
+              <w:keepNext w:val="false"/>
+              <w:spacing w:after="0" w:line="240"/>
+            </w:pPr>
+            <w:r>
+              <w:rPr>
+                <w:rFonts w:ascii="Times New Roman" w:cs="Times New Roman" w:eastAsia="Times New Roman" w:hAnsi="Times New Roman"/>
+                <w:sz w:val="22"/>
+                <w:szCs w:val="22"/>
+              </w:rPr>
+              <w:t xml:space="preserve">Admitted; tender proposed</w:t>
             </w:r>
           </w:p>
         </w:tc>
@@ -1332,7 +1332,7 @@
         </w:tc>
         <w:tc>
           <w:tcPr>
-            <w:tcW w:type="dxa" w:w="2400"/>
+            <w:tcW w:type="dxa" w:w="2340"/>
             <w:tcBorders>
               <w:top w:val="single" w:color="D9D9D9" w:sz="4"/>
               <w:left w:val="single" w:color="D9D9D9" w:sz="4"/>
@@ -1425,7 +1425,7 @@
         </w:tc>
         <w:tc>
           <w:tcPr>
-            <w:tcW w:type="dxa" w:w="1560"/>
+            <w:tcW w:type="dxa" w:w="1540"/>
             <w:tcBorders>
               <w:top w:val="single" w:color="D9D9D9" w:sz="4"/>
               <w:left w:val="single" w:color="D9D9D9" w:sz="4"/>
@@ -1456,7 +1456,7 @@
         </w:tc>
         <w:tc>
           <w:tcPr>
-            <w:tcW w:type="dxa" w:w="1440"/>
+            <w:tcW w:type="dxa" w:w="1300"/>
             <w:tcBorders>
               <w:top w:val="single" w:color="D9D9D9" w:sz="4"/>
               <w:left w:val="single" w:color="D9D9D9" w:sz="4"/>
@@ -1487,32 +1487,32 @@
         </w:tc>
         <w:tc>
           <w:tcPr>
-            <w:tcW w:type="dxa" w:w="1478"/>
-            <w:tcBorders>
-              <w:top w:val="single" w:color="D9D9D9" w:sz="4"/>
-              <w:left w:val="single" w:color="D9D9D9" w:sz="4"/>
-              <w:bottom w:val="single" w:color="D9D9D9" w:sz="4"/>
-              <w:right w:val="single" w:color="D9D9D9" w:sz="4"/>
-            </w:tcBorders>
-            <w:tcMar>
-              <w:top w:type="dxa" w:w="70"/>
-              <w:left w:type="dxa" w:w="80"/>
-              <w:bottom w:type="dxa" w:w="70"/>
-              <w:right w:type="dxa" w:w="80"/>
-            </w:tcMar>
-          </w:tcPr>
-          <w:p>
-            <w:pPr>
-              <w:keepNext w:val="false"/>
-              <w:spacing w:after="0" w:line="240"/>
-            </w:pPr>
-            <w:r>
-              <w:rPr>
-                <w:rFonts w:ascii="Times New Roman" w:cs="Times New Roman" w:eastAsia="Times New Roman" w:hAnsi="Times New Roman"/>
-                <w:sz w:val="22"/>
-                <w:szCs w:val="22"/>
-              </w:rPr>
-              <w:t xml:space="preserve">Admitted; tender</w:t>
+            <w:tcW w:type="dxa" w:w="1698"/>
+            <w:tcBorders>
+              <w:top w:val="single" w:color="D9D9D9" w:sz="4"/>
+              <w:left w:val="single" w:color="D9D9D9" w:sz="4"/>
+              <w:bottom w:val="single" w:color="D9D9D9" w:sz="4"/>
+              <w:right w:val="single" w:color="D9D9D9" w:sz="4"/>
+            </w:tcBorders>
+            <w:tcMar>
+              <w:top w:type="dxa" w:w="70"/>
+              <w:left w:type="dxa" w:w="80"/>
+              <w:bottom w:type="dxa" w:w="70"/>
+              <w:right w:type="dxa" w:w="80"/>
+            </w:tcMar>
+          </w:tcPr>
+          <w:p>
+            <w:pPr>
+              <w:keepNext w:val="false"/>
+              <w:spacing w:after="0" w:line="240"/>
+            </w:pPr>
+            <w:r>
+              <w:rPr>
+                <w:rFonts w:ascii="Times New Roman" w:cs="Times New Roman" w:eastAsia="Times New Roman" w:hAnsi="Times New Roman"/>
+                <w:sz w:val="22"/>
+                <w:szCs w:val="22"/>
+              </w:rPr>
+              <w:t xml:space="preserve">Admitted; tender proposed</w:t>
             </w:r>
           </w:p>
         </w:tc>
@@ -1555,7 +1555,7 @@
         </w:tc>
         <w:tc>
           <w:tcPr>
-            <w:tcW w:type="dxa" w:w="2400"/>
+            <w:tcW w:type="dxa" w:w="2340"/>
             <w:tcBorders>
               <w:top w:val="single" w:color="D9D9D9" w:sz="4"/>
               <w:left w:val="single" w:color="D9D9D9" w:sz="4"/>
@@ -1648,7 +1648,7 @@
         </w:tc>
         <w:tc>
           <w:tcPr>
-            <w:tcW w:type="dxa" w:w="1560"/>
+            <w:tcW w:type="dxa" w:w="1540"/>
             <w:tcBorders>
               <w:top w:val="single" w:color="D9D9D9" w:sz="4"/>
               <w:left w:val="single" w:color="D9D9D9" w:sz="4"/>
@@ -1679,7 +1679,7 @@
         </w:tc>
         <w:tc>
           <w:tcPr>
-            <w:tcW w:type="dxa" w:w="1440"/>
+            <w:tcW w:type="dxa" w:w="1300"/>
             <w:tcBorders>
               <w:top w:val="single" w:color="D9D9D9" w:sz="4"/>
               <w:left w:val="single" w:color="D9D9D9" w:sz="4"/>
@@ -1710,32 +1710,32 @@
         </w:tc>
         <w:tc>
           <w:tcPr>
-            <w:tcW w:type="dxa" w:w="1478"/>
-            <w:tcBorders>
-              <w:top w:val="single" w:color="D9D9D9" w:sz="4"/>
-              <w:left w:val="single" w:color="D9D9D9" w:sz="4"/>
-              <w:bottom w:val="single" w:color="D9D9D9" w:sz="4"/>
-              <w:right w:val="single" w:color="D9D9D9" w:sz="4"/>
-            </w:tcBorders>
-            <w:tcMar>
-              <w:top w:type="dxa" w:w="70"/>
-              <w:left w:type="dxa" w:w="80"/>
-              <w:bottom w:type="dxa" w:w="70"/>
-              <w:right w:type="dxa" w:w="80"/>
-            </w:tcMar>
-          </w:tcPr>
-          <w:p>
-            <w:pPr>
-              <w:keepNext w:val="false"/>
-              <w:spacing w:after="0" w:line="240"/>
-            </w:pPr>
-            <w:r>
-              <w:rPr>
-                <w:rFonts w:ascii="Times New Roman" w:cs="Times New Roman" w:eastAsia="Times New Roman" w:hAnsi="Times New Roman"/>
-                <w:sz w:val="22"/>
-                <w:szCs w:val="22"/>
-              </w:rPr>
-              <w:t xml:space="preserve">Admitted; tender</w:t>
+            <w:tcW w:type="dxa" w:w="1698"/>
+            <w:tcBorders>
+              <w:top w:val="single" w:color="D9D9D9" w:sz="4"/>
+              <w:left w:val="single" w:color="D9D9D9" w:sz="4"/>
+              <w:bottom w:val="single" w:color="D9D9D9" w:sz="4"/>
+              <w:right w:val="single" w:color="D9D9D9" w:sz="4"/>
+            </w:tcBorders>
+            <w:tcMar>
+              <w:top w:type="dxa" w:w="70"/>
+              <w:left w:type="dxa" w:w="80"/>
+              <w:bottom w:type="dxa" w:w="70"/>
+              <w:right w:type="dxa" w:w="80"/>
+            </w:tcMar>
+          </w:tcPr>
+          <w:p>
+            <w:pPr>
+              <w:keepNext w:val="false"/>
+              <w:spacing w:after="0" w:line="240"/>
+            </w:pPr>
+            <w:r>
+              <w:rPr>
+                <w:rFonts w:ascii="Times New Roman" w:cs="Times New Roman" w:eastAsia="Times New Roman" w:hAnsi="Times New Roman"/>
+                <w:sz w:val="22"/>
+                <w:szCs w:val="22"/>
+              </w:rPr>
+              <w:t xml:space="preserve">Admitted; tender proposed</w:t>
             </w:r>
           </w:p>
         </w:tc>
@@ -1778,7 +1778,7 @@
         </w:tc>
         <w:tc>
           <w:tcPr>
-            <w:tcW w:type="dxa" w:w="2400"/>
+            <w:tcW w:type="dxa" w:w="2340"/>
             <w:tcBorders>
               <w:top w:val="single" w:color="D9D9D9" w:sz="4"/>
               <w:left w:val="single" w:color="D9D9D9" w:sz="4"/>
@@ -1871,7 +1871,7 @@
         </w:tc>
         <w:tc>
           <w:tcPr>
-            <w:tcW w:type="dxa" w:w="1560"/>
+            <w:tcW w:type="dxa" w:w="1540"/>
             <w:tcBorders>
               <w:top w:val="single" w:color="D9D9D9" w:sz="4"/>
               <w:left w:val="single" w:color="D9D9D9" w:sz="4"/>
@@ -1902,7 +1902,7 @@
         </w:tc>
         <w:tc>
           <w:tcPr>
-            <w:tcW w:type="dxa" w:w="1440"/>
+            <w:tcW w:type="dxa" w:w="1300"/>
             <w:tcBorders>
               <w:top w:val="single" w:color="D9D9D9" w:sz="4"/>
               <w:left w:val="single" w:color="D9D9D9" w:sz="4"/>
@@ -1933,32 +1933,32 @@
         </w:tc>
         <w:tc>
           <w:tcPr>
-            <w:tcW w:type="dxa" w:w="1478"/>
-            <w:tcBorders>
-              <w:top w:val="single" w:color="D9D9D9" w:sz="4"/>
-              <w:left w:val="single" w:color="D9D9D9" w:sz="4"/>
-              <w:bottom w:val="single" w:color="D9D9D9" w:sz="4"/>
-              <w:right w:val="single" w:color="D9D9D9" w:sz="4"/>
-            </w:tcBorders>
-            <w:tcMar>
-              <w:top w:type="dxa" w:w="70"/>
-              <w:left w:type="dxa" w:w="80"/>
-              <w:bottom w:type="dxa" w:w="70"/>
-              <w:right w:type="dxa" w:w="80"/>
-            </w:tcMar>
-          </w:tcPr>
-          <w:p>
-            <w:pPr>
-              <w:keepNext w:val="false"/>
-              <w:spacing w:after="0" w:line="240"/>
-            </w:pPr>
-            <w:r>
-              <w:rPr>
-                <w:rFonts w:ascii="Times New Roman" w:cs="Times New Roman" w:eastAsia="Times New Roman" w:hAnsi="Times New Roman"/>
-                <w:sz w:val="22"/>
-                <w:szCs w:val="22"/>
-              </w:rPr>
-              <w:t xml:space="preserve">Admitted; tender</w:t>
+            <w:tcW w:type="dxa" w:w="1698"/>
+            <w:tcBorders>
+              <w:top w:val="single" w:color="D9D9D9" w:sz="4"/>
+              <w:left w:val="single" w:color="D9D9D9" w:sz="4"/>
+              <w:bottom w:val="single" w:color="D9D9D9" w:sz="4"/>
+              <w:right w:val="single" w:color="D9D9D9" w:sz="4"/>
+            </w:tcBorders>
+            <w:tcMar>
+              <w:top w:type="dxa" w:w="70"/>
+              <w:left w:type="dxa" w:w="80"/>
+              <w:bottom w:type="dxa" w:w="70"/>
+              <w:right w:type="dxa" w:w="80"/>
+            </w:tcMar>
+          </w:tcPr>
+          <w:p>
+            <w:pPr>
+              <w:keepNext w:val="false"/>
+              <w:spacing w:after="0" w:line="240"/>
+            </w:pPr>
+            <w:r>
+              <w:rPr>
+                <w:rFonts w:ascii="Times New Roman" w:cs="Times New Roman" w:eastAsia="Times New Roman" w:hAnsi="Times New Roman"/>
+                <w:sz w:val="22"/>
+                <w:szCs w:val="22"/>
+              </w:rPr>
+              <w:t xml:space="preserve">Admitted; tender proposed</w:t>
             </w:r>
           </w:p>
         </w:tc>
@@ -2001,7 +2001,7 @@
         </w:tc>
         <w:tc>
           <w:tcPr>
-            <w:tcW w:type="dxa" w:w="2400"/>
+            <w:tcW w:type="dxa" w:w="2340"/>
             <w:tcBorders>
               <w:top w:val="single" w:color="D9D9D9" w:sz="4"/>
               <w:left w:val="single" w:color="D9D9D9" w:sz="4"/>
@@ -2094,7 +2094,7 @@
         </w:tc>
         <w:tc>
           <w:tcPr>
-            <w:tcW w:type="dxa" w:w="1560"/>
+            <w:tcW w:type="dxa" w:w="1540"/>
             <w:tcBorders>
               <w:top w:val="single" w:color="D9D9D9" w:sz="4"/>
               <w:left w:val="single" w:color="D9D9D9" w:sz="4"/>
@@ -2125,7 +2125,7 @@
         </w:tc>
         <w:tc>
           <w:tcPr>
-            <w:tcW w:type="dxa" w:w="1440"/>
+            <w:tcW w:type="dxa" w:w="1300"/>
             <w:tcBorders>
               <w:top w:val="single" w:color="D9D9D9" w:sz="4"/>
               <w:left w:val="single" w:color="D9D9D9" w:sz="4"/>
@@ -2156,32 +2156,32 @@
         </w:tc>
         <w:tc>
           <w:tcPr>
-            <w:tcW w:type="dxa" w:w="1478"/>
-            <w:tcBorders>
-              <w:top w:val="single" w:color="D9D9D9" w:sz="4"/>
-              <w:left w:val="single" w:color="D9D9D9" w:sz="4"/>
-              <w:bottom w:val="single" w:color="D9D9D9" w:sz="4"/>
-              <w:right w:val="single" w:color="D9D9D9" w:sz="4"/>
-            </w:tcBorders>
-            <w:tcMar>
-              <w:top w:type="dxa" w:w="70"/>
-              <w:left w:type="dxa" w:w="80"/>
-              <w:bottom w:type="dxa" w:w="70"/>
-              <w:right w:type="dxa" w:w="80"/>
-            </w:tcMar>
-          </w:tcPr>
-          <w:p>
-            <w:pPr>
-              <w:keepNext w:val="false"/>
-              <w:spacing w:after="0" w:line="240"/>
-            </w:pPr>
-            <w:r>
-              <w:rPr>
-                <w:rFonts w:ascii="Times New Roman" w:cs="Times New Roman" w:eastAsia="Times New Roman" w:hAnsi="Times New Roman"/>
-                <w:sz w:val="22"/>
-                <w:szCs w:val="22"/>
-              </w:rPr>
-              <w:t xml:space="preserve">Admitted; tender</w:t>
+            <w:tcW w:type="dxa" w:w="1698"/>
+            <w:tcBorders>
+              <w:top w:val="single" w:color="D9D9D9" w:sz="4"/>
+              <w:left w:val="single" w:color="D9D9D9" w:sz="4"/>
+              <w:bottom w:val="single" w:color="D9D9D9" w:sz="4"/>
+              <w:right w:val="single" w:color="D9D9D9" w:sz="4"/>
+            </w:tcBorders>
+            <w:tcMar>
+              <w:top w:type="dxa" w:w="70"/>
+              <w:left w:type="dxa" w:w="80"/>
+              <w:bottom w:type="dxa" w:w="70"/>
+              <w:right w:type="dxa" w:w="80"/>
+            </w:tcMar>
+          </w:tcPr>
+          <w:p>
+            <w:pPr>
+              <w:keepNext w:val="false"/>
+              <w:spacing w:after="0" w:line="240"/>
+            </w:pPr>
+            <w:r>
+              <w:rPr>
+                <w:rFonts w:ascii="Times New Roman" w:cs="Times New Roman" w:eastAsia="Times New Roman" w:hAnsi="Times New Roman"/>
+                <w:sz w:val="22"/>
+                <w:szCs w:val="22"/>
+              </w:rPr>
+              <w:t xml:space="preserve">Admitted; tender proposed</w:t>
             </w:r>
           </w:p>
         </w:tc>
@@ -2224,7 +2224,7 @@
         </w:tc>
         <w:tc>
           <w:tcPr>
-            <w:tcW w:type="dxa" w:w="2400"/>
+            <w:tcW w:type="dxa" w:w="2340"/>
             <w:tcBorders>
               <w:top w:val="single" w:color="D9D9D9" w:sz="4"/>
               <w:left w:val="single" w:color="D9D9D9" w:sz="4"/>
@@ -2317,7 +2317,7 @@
         </w:tc>
         <w:tc>
           <w:tcPr>
-            <w:tcW w:type="dxa" w:w="1560"/>
+            <w:tcW w:type="dxa" w:w="1540"/>
             <w:tcBorders>
               <w:top w:val="single" w:color="D9D9D9" w:sz="4"/>
               <w:left w:val="single" w:color="D9D9D9" w:sz="4"/>
@@ -2348,7 +2348,7 @@
         </w:tc>
         <w:tc>
           <w:tcPr>
-            <w:tcW w:type="dxa" w:w="1440"/>
+            <w:tcW w:type="dxa" w:w="1300"/>
             <w:tcBorders>
               <w:top w:val="single" w:color="D9D9D9" w:sz="4"/>
               <w:left w:val="single" w:color="D9D9D9" w:sz="4"/>
@@ -2379,32 +2379,32 @@
         </w:tc>
         <w:tc>
           <w:tcPr>
-            <w:tcW w:type="dxa" w:w="1478"/>
-            <w:tcBorders>
-              <w:top w:val="single" w:color="D9D9D9" w:sz="4"/>
-              <w:left w:val="single" w:color="D9D9D9" w:sz="4"/>
-              <w:bottom w:val="single" w:color="D9D9D9" w:sz="4"/>
-              <w:right w:val="single" w:color="D9D9D9" w:sz="4"/>
-            </w:tcBorders>
-            <w:tcMar>
-              <w:top w:type="dxa" w:w="70"/>
-              <w:left w:type="dxa" w:w="80"/>
-              <w:bottom w:type="dxa" w:w="70"/>
-              <w:right w:type="dxa" w:w="80"/>
-            </w:tcMar>
-          </w:tcPr>
-          <w:p>
-            <w:pPr>
-              <w:keepNext w:val="false"/>
-              <w:spacing w:after="0" w:line="240"/>
-            </w:pPr>
-            <w:r>
-              <w:rPr>
-                <w:rFonts w:ascii="Times New Roman" w:cs="Times New Roman" w:eastAsia="Times New Roman" w:hAnsi="Times New Roman"/>
-                <w:sz w:val="22"/>
-                <w:szCs w:val="22"/>
-              </w:rPr>
-              <w:t xml:space="preserve">Admitted; tender</w:t>
+            <w:tcW w:type="dxa" w:w="1698"/>
+            <w:tcBorders>
+              <w:top w:val="single" w:color="D9D9D9" w:sz="4"/>
+              <w:left w:val="single" w:color="D9D9D9" w:sz="4"/>
+              <w:bottom w:val="single" w:color="D9D9D9" w:sz="4"/>
+              <w:right w:val="single" w:color="D9D9D9" w:sz="4"/>
+            </w:tcBorders>
+            <w:tcMar>
+              <w:top w:type="dxa" w:w="70"/>
+              <w:left w:type="dxa" w:w="80"/>
+              <w:bottom w:type="dxa" w:w="70"/>
+              <w:right w:type="dxa" w:w="80"/>
+            </w:tcMar>
+          </w:tcPr>
+          <w:p>
+            <w:pPr>
+              <w:keepNext w:val="false"/>
+              <w:spacing w:after="0" w:line="240"/>
+            </w:pPr>
+            <w:r>
+              <w:rPr>
+                <w:rFonts w:ascii="Times New Roman" w:cs="Times New Roman" w:eastAsia="Times New Roman" w:hAnsi="Times New Roman"/>
+                <w:sz w:val="22"/>
+                <w:szCs w:val="22"/>
+              </w:rPr>
+              <w:t xml:space="preserve">Admitted; tender proposed</w:t>
             </w:r>
           </w:p>
         </w:tc>
@@ -2447,7 +2447,7 @@
         </w:tc>
         <w:tc>
           <w:tcPr>
-            <w:tcW w:type="dxa" w:w="2400"/>
+            <w:tcW w:type="dxa" w:w="2340"/>
             <w:tcBorders>
               <w:top w:val="single" w:color="D9D9D9" w:sz="4"/>
               <w:left w:val="single" w:color="D9D9D9" w:sz="4"/>
@@ -2540,7 +2540,7 @@
         </w:tc>
         <w:tc>
           <w:tcPr>
-            <w:tcW w:type="dxa" w:w="1560"/>
+            <w:tcW w:type="dxa" w:w="1540"/>
             <w:tcBorders>
               <w:top w:val="single" w:color="D9D9D9" w:sz="4"/>
               <w:left w:val="single" w:color="D9D9D9" w:sz="4"/>
@@ -2571,7 +2571,7 @@
         </w:tc>
         <w:tc>
           <w:tcPr>
-            <w:tcW w:type="dxa" w:w="1440"/>
+            <w:tcW w:type="dxa" w:w="1300"/>
             <w:tcBorders>
               <w:top w:val="single" w:color="D9D9D9" w:sz="4"/>
               <w:left w:val="single" w:color="D9D9D9" w:sz="4"/>
@@ -2602,32 +2602,32 @@
         </w:tc>
         <w:tc>
           <w:tcPr>
-            <w:tcW w:type="dxa" w:w="1478"/>
-            <w:tcBorders>
-              <w:top w:val="single" w:color="D9D9D9" w:sz="4"/>
-              <w:left w:val="single" w:color="D9D9D9" w:sz="4"/>
-              <w:bottom w:val="single" w:color="D9D9D9" w:sz="4"/>
-              <w:right w:val="single" w:color="D9D9D9" w:sz="4"/>
-            </w:tcBorders>
-            <w:tcMar>
-              <w:top w:type="dxa" w:w="70"/>
-              <w:left w:type="dxa" w:w="80"/>
-              <w:bottom w:type="dxa" w:w="70"/>
-              <w:right w:type="dxa" w:w="80"/>
-            </w:tcMar>
-          </w:tcPr>
-          <w:p>
-            <w:pPr>
-              <w:keepNext w:val="false"/>
-              <w:spacing w:after="0" w:line="240"/>
-            </w:pPr>
-            <w:r>
-              <w:rPr>
-                <w:rFonts w:ascii="Times New Roman" w:cs="Times New Roman" w:eastAsia="Times New Roman" w:hAnsi="Times New Roman"/>
-                <w:sz w:val="22"/>
-                <w:szCs w:val="22"/>
-              </w:rPr>
-              <w:t xml:space="preserve">Admitted; tender</w:t>
+            <w:tcW w:type="dxa" w:w="1698"/>
+            <w:tcBorders>
+              <w:top w:val="single" w:color="D9D9D9" w:sz="4"/>
+              <w:left w:val="single" w:color="D9D9D9" w:sz="4"/>
+              <w:bottom w:val="single" w:color="D9D9D9" w:sz="4"/>
+              <w:right w:val="single" w:color="D9D9D9" w:sz="4"/>
+            </w:tcBorders>
+            <w:tcMar>
+              <w:top w:type="dxa" w:w="70"/>
+              <w:left w:type="dxa" w:w="80"/>
+              <w:bottom w:type="dxa" w:w="70"/>
+              <w:right w:type="dxa" w:w="80"/>
+            </w:tcMar>
+          </w:tcPr>
+          <w:p>
+            <w:pPr>
+              <w:keepNext w:val="false"/>
+              <w:spacing w:after="0" w:line="240"/>
+            </w:pPr>
+            <w:r>
+              <w:rPr>
+                <w:rFonts w:ascii="Times New Roman" w:cs="Times New Roman" w:eastAsia="Times New Roman" w:hAnsi="Times New Roman"/>
+                <w:sz w:val="22"/>
+                <w:szCs w:val="22"/>
+              </w:rPr>
+              <w:t xml:space="preserve">Admitted; tender proposed</w:t>
             </w:r>
           </w:p>
         </w:tc>
@@ -2670,7 +2670,7 @@
         </w:tc>
         <w:tc>
           <w:tcPr>
-            <w:tcW w:type="dxa" w:w="2400"/>
+            <w:tcW w:type="dxa" w:w="2340"/>
             <w:tcBorders>
               <w:top w:val="single" w:color="D9D9D9" w:sz="4"/>
               <w:left w:val="single" w:color="D9D9D9" w:sz="4"/>
@@ -2763,7 +2763,7 @@
         </w:tc>
         <w:tc>
           <w:tcPr>
-            <w:tcW w:type="dxa" w:w="1560"/>
+            <w:tcW w:type="dxa" w:w="1540"/>
             <w:tcBorders>
               <w:top w:val="single" w:color="D9D9D9" w:sz="4"/>
               <w:left w:val="single" w:color="D9D9D9" w:sz="4"/>
@@ -2794,7 +2794,7 @@
         </w:tc>
         <w:tc>
           <w:tcPr>
-            <w:tcW w:type="dxa" w:w="1440"/>
+            <w:tcW w:type="dxa" w:w="1300"/>
             <w:tcBorders>
               <w:top w:val="single" w:color="D9D9D9" w:sz="4"/>
               <w:left w:val="single" w:color="D9D9D9" w:sz="4"/>
@@ -2825,32 +2825,32 @@
         </w:tc>
         <w:tc>
           <w:tcPr>
-            <w:tcW w:type="dxa" w:w="1478"/>
-            <w:tcBorders>
-              <w:top w:val="single" w:color="D9D9D9" w:sz="4"/>
-              <w:left w:val="single" w:color="D9D9D9" w:sz="4"/>
-              <w:bottom w:val="single" w:color="D9D9D9" w:sz="4"/>
-              <w:right w:val="single" w:color="D9D9D9" w:sz="4"/>
-            </w:tcBorders>
-            <w:tcMar>
-              <w:top w:type="dxa" w:w="70"/>
-              <w:left w:type="dxa" w:w="80"/>
-              <w:bottom w:type="dxa" w:w="70"/>
-              <w:right w:type="dxa" w:w="80"/>
-            </w:tcMar>
-          </w:tcPr>
-          <w:p>
-            <w:pPr>
-              <w:keepNext w:val="false"/>
-              <w:spacing w:after="0" w:line="240"/>
-            </w:pPr>
-            <w:r>
-              <w:rPr>
-                <w:rFonts w:ascii="Times New Roman" w:cs="Times New Roman" w:eastAsia="Times New Roman" w:hAnsi="Times New Roman"/>
-                <w:sz w:val="22"/>
-                <w:szCs w:val="22"/>
-              </w:rPr>
-              <w:t xml:space="preserve">Admitted; tender</w:t>
+            <w:tcW w:type="dxa" w:w="1698"/>
+            <w:tcBorders>
+              <w:top w:val="single" w:color="D9D9D9" w:sz="4"/>
+              <w:left w:val="single" w:color="D9D9D9" w:sz="4"/>
+              <w:bottom w:val="single" w:color="D9D9D9" w:sz="4"/>
+              <w:right w:val="single" w:color="D9D9D9" w:sz="4"/>
+            </w:tcBorders>
+            <w:tcMar>
+              <w:top w:type="dxa" w:w="70"/>
+              <w:left w:type="dxa" w:w="80"/>
+              <w:bottom w:type="dxa" w:w="70"/>
+              <w:right w:type="dxa" w:w="80"/>
+            </w:tcMar>
+          </w:tcPr>
+          <w:p>
+            <w:pPr>
+              <w:keepNext w:val="false"/>
+              <w:spacing w:after="0" w:line="240"/>
+            </w:pPr>
+            <w:r>
+              <w:rPr>
+                <w:rFonts w:ascii="Times New Roman" w:cs="Times New Roman" w:eastAsia="Times New Roman" w:hAnsi="Times New Roman"/>
+                <w:sz w:val="22"/>
+                <w:szCs w:val="22"/>
+              </w:rPr>
+              <w:t xml:space="preserve">Admitted; tender proposed</w:t>
             </w:r>
           </w:p>
         </w:tc>
@@ -2893,7 +2893,7 @@
         </w:tc>
         <w:tc>
           <w:tcPr>
-            <w:tcW w:type="dxa" w:w="2400"/>
+            <w:tcW w:type="dxa" w:w="2340"/>
             <w:tcBorders>
               <w:top w:val="single" w:color="D9D9D9" w:sz="4"/>
               <w:left w:val="single" w:color="D9D9D9" w:sz="4"/>
@@ -2986,7 +2986,7 @@
         </w:tc>
         <w:tc>
           <w:tcPr>
-            <w:tcW w:type="dxa" w:w="1560"/>
+            <w:tcW w:type="dxa" w:w="1540"/>
             <w:tcBorders>
               <w:top w:val="single" w:color="D9D9D9" w:sz="4"/>
               <w:left w:val="single" w:color="D9D9D9" w:sz="4"/>
@@ -3017,7 +3017,7 @@
         </w:tc>
         <w:tc>
           <w:tcPr>
-            <w:tcW w:type="dxa" w:w="1440"/>
+            <w:tcW w:type="dxa" w:w="1300"/>
             <w:tcBorders>
               <w:top w:val="single" w:color="D9D9D9" w:sz="4"/>
               <w:left w:val="single" w:color="D9D9D9" w:sz="4"/>
@@ -3048,32 +3048,32 @@
         </w:tc>
         <w:tc>
           <w:tcPr>
-            <w:tcW w:type="dxa" w:w="1478"/>
-            <w:tcBorders>
-              <w:top w:val="single" w:color="D9D9D9" w:sz="4"/>
-              <w:left w:val="single" w:color="D9D9D9" w:sz="4"/>
-              <w:bottom w:val="single" w:color="D9D9D9" w:sz="4"/>
-              <w:right w:val="single" w:color="D9D9D9" w:sz="4"/>
-            </w:tcBorders>
-            <w:tcMar>
-              <w:top w:type="dxa" w:w="70"/>
-              <w:left w:type="dxa" w:w="80"/>
-              <w:bottom w:type="dxa" w:w="70"/>
-              <w:right w:type="dxa" w:w="80"/>
-            </w:tcMar>
-          </w:tcPr>
-          <w:p>
-            <w:pPr>
-              <w:keepNext w:val="false"/>
-              <w:spacing w:after="0" w:line="240"/>
-            </w:pPr>
-            <w:r>
-              <w:rPr>
-                <w:rFonts w:ascii="Times New Roman" w:cs="Times New Roman" w:eastAsia="Times New Roman" w:hAnsi="Times New Roman"/>
-                <w:sz w:val="22"/>
-                <w:szCs w:val="22"/>
-              </w:rPr>
-              <w:t xml:space="preserve">Admitted; tender</w:t>
+            <w:tcW w:type="dxa" w:w="1698"/>
+            <w:tcBorders>
+              <w:top w:val="single" w:color="D9D9D9" w:sz="4"/>
+              <w:left w:val="single" w:color="D9D9D9" w:sz="4"/>
+              <w:bottom w:val="single" w:color="D9D9D9" w:sz="4"/>
+              <w:right w:val="single" w:color="D9D9D9" w:sz="4"/>
+            </w:tcBorders>
+            <w:tcMar>
+              <w:top w:type="dxa" w:w="70"/>
+              <w:left w:type="dxa" w:w="80"/>
+              <w:bottom w:type="dxa" w:w="70"/>
+              <w:right w:type="dxa" w:w="80"/>
+            </w:tcMar>
+          </w:tcPr>
+          <w:p>
+            <w:pPr>
+              <w:keepNext w:val="false"/>
+              <w:spacing w:after="0" w:line="240"/>
+            </w:pPr>
+            <w:r>
+              <w:rPr>
+                <w:rFonts w:ascii="Times New Roman" w:cs="Times New Roman" w:eastAsia="Times New Roman" w:hAnsi="Times New Roman"/>
+                <w:sz w:val="22"/>
+                <w:szCs w:val="22"/>
+              </w:rPr>
+              <w:t xml:space="preserve">Admitted; tender proposed</w:t>
             </w:r>
           </w:p>
         </w:tc>
@@ -3116,7 +3116,7 @@
         </w:tc>
         <w:tc>
           <w:tcPr>
-            <w:tcW w:type="dxa" w:w="2400"/>
+            <w:tcW w:type="dxa" w:w="2340"/>
             <w:tcBorders>
               <w:top w:val="single" w:color="D9D9D9" w:sz="4"/>
               <w:left w:val="single" w:color="D9D9D9" w:sz="4"/>
@@ -3209,7 +3209,7 @@
         </w:tc>
         <w:tc>
           <w:tcPr>
-            <w:tcW w:type="dxa" w:w="1560"/>
+            <w:tcW w:type="dxa" w:w="1540"/>
             <w:tcBorders>
               <w:top w:val="single" w:color="D9D9D9" w:sz="4"/>
               <w:left w:val="single" w:color="D9D9D9" w:sz="4"/>
@@ -3240,7 +3240,7 @@
         </w:tc>
         <w:tc>
           <w:tcPr>
-            <w:tcW w:type="dxa" w:w="1440"/>
+            <w:tcW w:type="dxa" w:w="1300"/>
             <w:tcBorders>
               <w:top w:val="single" w:color="D9D9D9" w:sz="4"/>
               <w:left w:val="single" w:color="D9D9D9" w:sz="4"/>
@@ -3271,32 +3271,32 @@
         </w:tc>
         <w:tc>
           <w:tcPr>
-            <w:tcW w:type="dxa" w:w="1478"/>
-            <w:tcBorders>
-              <w:top w:val="single" w:color="D9D9D9" w:sz="4"/>
-              <w:left w:val="single" w:color="D9D9D9" w:sz="4"/>
-              <w:bottom w:val="single" w:color="D9D9D9" w:sz="4"/>
-              <w:right w:val="single" w:color="D9D9D9" w:sz="4"/>
-            </w:tcBorders>
-            <w:tcMar>
-              <w:top w:type="dxa" w:w="70"/>
-              <w:left w:type="dxa" w:w="80"/>
-              <w:bottom w:type="dxa" w:w="70"/>
-              <w:right w:type="dxa" w:w="80"/>
-            </w:tcMar>
-          </w:tcPr>
-          <w:p>
-            <w:pPr>
-              <w:keepNext w:val="false"/>
-              <w:spacing w:after="0" w:line="240"/>
-            </w:pPr>
-            <w:r>
-              <w:rPr>
-                <w:rFonts w:ascii="Times New Roman" w:cs="Times New Roman" w:eastAsia="Times New Roman" w:hAnsi="Times New Roman"/>
-                <w:sz w:val="22"/>
-                <w:szCs w:val="22"/>
-              </w:rPr>
-              <w:t xml:space="preserve">Admitted; tender</w:t>
+            <w:tcW w:type="dxa" w:w="1698"/>
+            <w:tcBorders>
+              <w:top w:val="single" w:color="D9D9D9" w:sz="4"/>
+              <w:left w:val="single" w:color="D9D9D9" w:sz="4"/>
+              <w:bottom w:val="single" w:color="D9D9D9" w:sz="4"/>
+              <w:right w:val="single" w:color="D9D9D9" w:sz="4"/>
+            </w:tcBorders>
+            <w:tcMar>
+              <w:top w:type="dxa" w:w="70"/>
+              <w:left w:type="dxa" w:w="80"/>
+              <w:bottom w:type="dxa" w:w="70"/>
+              <w:right w:type="dxa" w:w="80"/>
+            </w:tcMar>
+          </w:tcPr>
+          <w:p>
+            <w:pPr>
+              <w:keepNext w:val="false"/>
+              <w:spacing w:after="0" w:line="240"/>
+            </w:pPr>
+            <w:r>
+              <w:rPr>
+                <w:rFonts w:ascii="Times New Roman" w:cs="Times New Roman" w:eastAsia="Times New Roman" w:hAnsi="Times New Roman"/>
+                <w:sz w:val="22"/>
+                <w:szCs w:val="22"/>
+              </w:rPr>
+              <w:t xml:space="preserve">Admitted; tender proposed</w:t>
             </w:r>
           </w:p>
         </w:tc>
@@ -3339,7 +3339,7 @@
         </w:tc>
         <w:tc>
           <w:tcPr>
-            <w:tcW w:type="dxa" w:w="2400"/>
+            <w:tcW w:type="dxa" w:w="2340"/>
             <w:tcBorders>
               <w:top w:val="single" w:color="D9D9D9" w:sz="4"/>
               <w:left w:val="single" w:color="D9D9D9" w:sz="4"/>
@@ -3432,7 +3432,7 @@
         </w:tc>
         <w:tc>
           <w:tcPr>
-            <w:tcW w:type="dxa" w:w="1560"/>
+            <w:tcW w:type="dxa" w:w="1540"/>
             <w:tcBorders>
               <w:top w:val="single" w:color="D9D9D9" w:sz="4"/>
               <w:left w:val="single" w:color="D9D9D9" w:sz="4"/>
@@ -3463,7 +3463,7 @@
         </w:tc>
         <w:tc>
           <w:tcPr>
-            <w:tcW w:type="dxa" w:w="1440"/>
+            <w:tcW w:type="dxa" w:w="1300"/>
             <w:tcBorders>
               <w:top w:val="single" w:color="D9D9D9" w:sz="4"/>
               <w:left w:val="single" w:color="D9D9D9" w:sz="4"/>
@@ -3494,32 +3494,32 @@
         </w:tc>
         <w:tc>
           <w:tcPr>
-            <w:tcW w:type="dxa" w:w="1478"/>
-            <w:tcBorders>
-              <w:top w:val="single" w:color="D9D9D9" w:sz="4"/>
-              <w:left w:val="single" w:color="D9D9D9" w:sz="4"/>
-              <w:bottom w:val="single" w:color="D9D9D9" w:sz="4"/>
-              <w:right w:val="single" w:color="D9D9D9" w:sz="4"/>
-            </w:tcBorders>
-            <w:tcMar>
-              <w:top w:type="dxa" w:w="70"/>
-              <w:left w:type="dxa" w:w="80"/>
-              <w:bottom w:type="dxa" w:w="70"/>
-              <w:right w:type="dxa" w:w="80"/>
-            </w:tcMar>
-          </w:tcPr>
-          <w:p>
-            <w:pPr>
-              <w:keepNext w:val="false"/>
-              <w:spacing w:after="0" w:line="240"/>
-            </w:pPr>
-            <w:r>
-              <w:rPr>
-                <w:rFonts w:ascii="Times New Roman" w:cs="Times New Roman" w:eastAsia="Times New Roman" w:hAnsi="Times New Roman"/>
-                <w:sz w:val="22"/>
-                <w:szCs w:val="22"/>
-              </w:rPr>
-              <w:t xml:space="preserve">Admitted; tender</w:t>
+            <w:tcW w:type="dxa" w:w="1698"/>
+            <w:tcBorders>
+              <w:top w:val="single" w:color="D9D9D9" w:sz="4"/>
+              <w:left w:val="single" w:color="D9D9D9" w:sz="4"/>
+              <w:bottom w:val="single" w:color="D9D9D9" w:sz="4"/>
+              <w:right w:val="single" w:color="D9D9D9" w:sz="4"/>
+            </w:tcBorders>
+            <w:tcMar>
+              <w:top w:type="dxa" w:w="70"/>
+              <w:left w:type="dxa" w:w="80"/>
+              <w:bottom w:type="dxa" w:w="70"/>
+              <w:right w:type="dxa" w:w="80"/>
+            </w:tcMar>
+          </w:tcPr>
+          <w:p>
+            <w:pPr>
+              <w:keepNext w:val="false"/>
+              <w:spacing w:after="0" w:line="240"/>
+            </w:pPr>
+            <w:r>
+              <w:rPr>
+                <w:rFonts w:ascii="Times New Roman" w:cs="Times New Roman" w:eastAsia="Times New Roman" w:hAnsi="Times New Roman"/>
+                <w:sz w:val="22"/>
+                <w:szCs w:val="22"/>
+              </w:rPr>
+              <w:t xml:space="preserve">Admitted; tender proposed</w:t>
             </w:r>
           </w:p>
         </w:tc>
@@ -3562,7 +3562,7 @@
         </w:tc>
         <w:tc>
           <w:tcPr>
-            <w:tcW w:type="dxa" w:w="2400"/>
+            <w:tcW w:type="dxa" w:w="2340"/>
             <w:tcBorders>
               <w:top w:val="single" w:color="D9D9D9" w:sz="4"/>
               <w:left w:val="single" w:color="D9D9D9" w:sz="4"/>
@@ -3655,7 +3655,7 @@
         </w:tc>
         <w:tc>
           <w:tcPr>
-            <w:tcW w:type="dxa" w:w="1560"/>
+            <w:tcW w:type="dxa" w:w="1540"/>
             <w:tcBorders>
               <w:top w:val="single" w:color="D9D9D9" w:sz="4"/>
               <w:left w:val="single" w:color="D9D9D9" w:sz="4"/>
@@ -3686,7 +3686,7 @@
         </w:tc>
         <w:tc>
           <w:tcPr>
-            <w:tcW w:type="dxa" w:w="1440"/>
+            <w:tcW w:type="dxa" w:w="1300"/>
             <w:tcBorders>
               <w:top w:val="single" w:color="D9D9D9" w:sz="4"/>
               <w:left w:val="single" w:color="D9D9D9" w:sz="4"/>
@@ -3717,32 +3717,32 @@
         </w:tc>
         <w:tc>
           <w:tcPr>
-            <w:tcW w:type="dxa" w:w="1478"/>
-            <w:tcBorders>
-              <w:top w:val="single" w:color="D9D9D9" w:sz="4"/>
-              <w:left w:val="single" w:color="D9D9D9" w:sz="4"/>
-              <w:bottom w:val="single" w:color="D9D9D9" w:sz="4"/>
-              <w:right w:val="single" w:color="D9D9D9" w:sz="4"/>
-            </w:tcBorders>
-            <w:tcMar>
-              <w:top w:type="dxa" w:w="70"/>
-              <w:left w:type="dxa" w:w="80"/>
-              <w:bottom w:type="dxa" w:w="70"/>
-              <w:right w:type="dxa" w:w="80"/>
-            </w:tcMar>
-          </w:tcPr>
-          <w:p>
-            <w:pPr>
-              <w:keepNext w:val="false"/>
-              <w:spacing w:after="0" w:line="240"/>
-            </w:pPr>
-            <w:r>
-              <w:rPr>
-                <w:rFonts w:ascii="Times New Roman" w:cs="Times New Roman" w:eastAsia="Times New Roman" w:hAnsi="Times New Roman"/>
-                <w:sz w:val="22"/>
-                <w:szCs w:val="22"/>
-              </w:rPr>
-              <w:t xml:space="preserve">Admitted; tender</w:t>
+            <w:tcW w:type="dxa" w:w="1698"/>
+            <w:tcBorders>
+              <w:top w:val="single" w:color="D9D9D9" w:sz="4"/>
+              <w:left w:val="single" w:color="D9D9D9" w:sz="4"/>
+              <w:bottom w:val="single" w:color="D9D9D9" w:sz="4"/>
+              <w:right w:val="single" w:color="D9D9D9" w:sz="4"/>
+            </w:tcBorders>
+            <w:tcMar>
+              <w:top w:type="dxa" w:w="70"/>
+              <w:left w:type="dxa" w:w="80"/>
+              <w:bottom w:type="dxa" w:w="70"/>
+              <w:right w:type="dxa" w:w="80"/>
+            </w:tcMar>
+          </w:tcPr>
+          <w:p>
+            <w:pPr>
+              <w:keepNext w:val="false"/>
+              <w:spacing w:after="0" w:line="240"/>
+            </w:pPr>
+            <w:r>
+              <w:rPr>
+                <w:rFonts w:ascii="Times New Roman" w:cs="Times New Roman" w:eastAsia="Times New Roman" w:hAnsi="Times New Roman"/>
+                <w:sz w:val="22"/>
+                <w:szCs w:val="22"/>
+              </w:rPr>
+              <w:t xml:space="preserve">Admitted; tender proposed</w:t>
             </w:r>
           </w:p>
         </w:tc>
@@ -3785,7 +3785,7 @@
         </w:tc>
         <w:tc>
           <w:tcPr>
-            <w:tcW w:type="dxa" w:w="2400"/>
+            <w:tcW w:type="dxa" w:w="2340"/>
             <w:tcBorders>
               <w:top w:val="single" w:color="D9D9D9" w:sz="4"/>
               <w:left w:val="single" w:color="D9D9D9" w:sz="4"/>
@@ -3878,7 +3878,7 @@
         </w:tc>
         <w:tc>
           <w:tcPr>
-            <w:tcW w:type="dxa" w:w="1560"/>
+            <w:tcW w:type="dxa" w:w="1540"/>
             <w:tcBorders>
               <w:top w:val="single" w:color="D9D9D9" w:sz="4"/>
               <w:left w:val="single" w:color="D9D9D9" w:sz="4"/>
@@ -3909,7 +3909,7 @@
         </w:tc>
         <w:tc>
           <w:tcPr>
-            <w:tcW w:type="dxa" w:w="1440"/>
+            <w:tcW w:type="dxa" w:w="1300"/>
             <w:tcBorders>
               <w:top w:val="single" w:color="D9D9D9" w:sz="4"/>
               <w:left w:val="single" w:color="D9D9D9" w:sz="4"/>
@@ -3940,32 +3940,32 @@
         </w:tc>
         <w:tc>
           <w:tcPr>
-            <w:tcW w:type="dxa" w:w="1478"/>
-            <w:tcBorders>
-              <w:top w:val="single" w:color="D9D9D9" w:sz="4"/>
-              <w:left w:val="single" w:color="D9D9D9" w:sz="4"/>
-              <w:bottom w:val="single" w:color="D9D9D9" w:sz="4"/>
-              <w:right w:val="single" w:color="D9D9D9" w:sz="4"/>
-            </w:tcBorders>
-            <w:tcMar>
-              <w:top w:type="dxa" w:w="70"/>
-              <w:left w:type="dxa" w:w="80"/>
-              <w:bottom w:type="dxa" w:w="70"/>
-              <w:right w:type="dxa" w:w="80"/>
-            </w:tcMar>
-          </w:tcPr>
-          <w:p>
-            <w:pPr>
-              <w:keepNext w:val="false"/>
-              <w:spacing w:after="0" w:line="240"/>
-            </w:pPr>
-            <w:r>
-              <w:rPr>
-                <w:rFonts w:ascii="Times New Roman" w:cs="Times New Roman" w:eastAsia="Times New Roman" w:hAnsi="Times New Roman"/>
-                <w:sz w:val="22"/>
-                <w:szCs w:val="22"/>
-              </w:rPr>
-              <w:t xml:space="preserve">Admitted; tender</w:t>
+            <w:tcW w:type="dxa" w:w="1698"/>
+            <w:tcBorders>
+              <w:top w:val="single" w:color="D9D9D9" w:sz="4"/>
+              <w:left w:val="single" w:color="D9D9D9" w:sz="4"/>
+              <w:bottom w:val="single" w:color="D9D9D9" w:sz="4"/>
+              <w:right w:val="single" w:color="D9D9D9" w:sz="4"/>
+            </w:tcBorders>
+            <w:tcMar>
+              <w:top w:type="dxa" w:w="70"/>
+              <w:left w:type="dxa" w:w="80"/>
+              <w:bottom w:type="dxa" w:w="70"/>
+              <w:right w:type="dxa" w:w="80"/>
+            </w:tcMar>
+          </w:tcPr>
+          <w:p>
+            <w:pPr>
+              <w:keepNext w:val="false"/>
+              <w:spacing w:after="0" w:line="240"/>
+            </w:pPr>
+            <w:r>
+              <w:rPr>
+                <w:rFonts w:ascii="Times New Roman" w:cs="Times New Roman" w:eastAsia="Times New Roman" w:hAnsi="Times New Roman"/>
+                <w:sz w:val="22"/>
+                <w:szCs w:val="22"/>
+              </w:rPr>
+              <w:t xml:space="preserve">Admitted; tender proposed</w:t>
             </w:r>
           </w:p>
         </w:tc>
@@ -4008,7 +4008,7 @@
         </w:tc>
         <w:tc>
           <w:tcPr>
-            <w:tcW w:type="dxa" w:w="2400"/>
+            <w:tcW w:type="dxa" w:w="2340"/>
             <w:tcBorders>
               <w:top w:val="single" w:color="D9D9D9" w:sz="4"/>
               <w:left w:val="single" w:color="D9D9D9" w:sz="4"/>
@@ -4101,7 +4101,7 @@
         </w:tc>
         <w:tc>
           <w:tcPr>
-            <w:tcW w:type="dxa" w:w="1560"/>
+            <w:tcW w:type="dxa" w:w="1540"/>
             <w:tcBorders>
               <w:top w:val="single" w:color="D9D9D9" w:sz="4"/>
               <w:left w:val="single" w:color="D9D9D9" w:sz="4"/>
@@ -4132,7 +4132,7 @@
         </w:tc>
         <w:tc>
           <w:tcPr>
-            <w:tcW w:type="dxa" w:w="1440"/>
+            <w:tcW w:type="dxa" w:w="1300"/>
             <w:tcBorders>
               <w:top w:val="single" w:color="D9D9D9" w:sz="4"/>
               <w:left w:val="single" w:color="D9D9D9" w:sz="4"/>
@@ -4163,32 +4163,32 @@
         </w:tc>
         <w:tc>
           <w:tcPr>
-            <w:tcW w:type="dxa" w:w="1478"/>
-            <w:tcBorders>
-              <w:top w:val="single" w:color="D9D9D9" w:sz="4"/>
-              <w:left w:val="single" w:color="D9D9D9" w:sz="4"/>
-              <w:bottom w:val="single" w:color="D9D9D9" w:sz="4"/>
-              <w:right w:val="single" w:color="D9D9D9" w:sz="4"/>
-            </w:tcBorders>
-            <w:tcMar>
-              <w:top w:type="dxa" w:w="70"/>
-              <w:left w:type="dxa" w:w="80"/>
-              <w:bottom w:type="dxa" w:w="70"/>
-              <w:right w:type="dxa" w:w="80"/>
-            </w:tcMar>
-          </w:tcPr>
-          <w:p>
-            <w:pPr>
-              <w:keepNext w:val="false"/>
-              <w:spacing w:after="0" w:line="240"/>
-            </w:pPr>
-            <w:r>
-              <w:rPr>
-                <w:rFonts w:ascii="Times New Roman" w:cs="Times New Roman" w:eastAsia="Times New Roman" w:hAnsi="Times New Roman"/>
-                <w:sz w:val="22"/>
-                <w:szCs w:val="22"/>
-              </w:rPr>
-              <w:t xml:space="preserve">Admitted; tender</w:t>
+            <w:tcW w:type="dxa" w:w="1698"/>
+            <w:tcBorders>
+              <w:top w:val="single" w:color="D9D9D9" w:sz="4"/>
+              <w:left w:val="single" w:color="D9D9D9" w:sz="4"/>
+              <w:bottom w:val="single" w:color="D9D9D9" w:sz="4"/>
+              <w:right w:val="single" w:color="D9D9D9" w:sz="4"/>
+            </w:tcBorders>
+            <w:tcMar>
+              <w:top w:type="dxa" w:w="70"/>
+              <w:left w:type="dxa" w:w="80"/>
+              <w:bottom w:type="dxa" w:w="70"/>
+              <w:right w:type="dxa" w:w="80"/>
+            </w:tcMar>
+          </w:tcPr>
+          <w:p>
+            <w:pPr>
+              <w:keepNext w:val="false"/>
+              <w:spacing w:after="0" w:line="240"/>
+            </w:pPr>
+            <w:r>
+              <w:rPr>
+                <w:rFonts w:ascii="Times New Roman" w:cs="Times New Roman" w:eastAsia="Times New Roman" w:hAnsi="Times New Roman"/>
+                <w:sz w:val="22"/>
+                <w:szCs w:val="22"/>
+              </w:rPr>
+              <w:t xml:space="preserve">Admitted; tender proposed</w:t>
             </w:r>
           </w:p>
         </w:tc>
@@ -4231,7 +4231,7 @@
         </w:tc>
         <w:tc>
           <w:tcPr>
-            <w:tcW w:type="dxa" w:w="2400"/>
+            <w:tcW w:type="dxa" w:w="2340"/>
             <w:tcBorders>
               <w:top w:val="single" w:color="D9D9D9" w:sz="4"/>
               <w:left w:val="single" w:color="D9D9D9" w:sz="4"/>
@@ -4324,7 +4324,7 @@
         </w:tc>
         <w:tc>
           <w:tcPr>
-            <w:tcW w:type="dxa" w:w="1560"/>
+            <w:tcW w:type="dxa" w:w="1540"/>
             <w:tcBorders>
               <w:top w:val="single" w:color="D9D9D9" w:sz="4"/>
               <w:left w:val="single" w:color="D9D9D9" w:sz="4"/>
@@ -4355,7 +4355,7 @@
         </w:tc>
         <w:tc>
           <w:tcPr>
-            <w:tcW w:type="dxa" w:w="1440"/>
+            <w:tcW w:type="dxa" w:w="1300"/>
             <w:tcBorders>
               <w:top w:val="single" w:color="D9D9D9" w:sz="4"/>
               <w:left w:val="single" w:color="D9D9D9" w:sz="4"/>
@@ -4386,32 +4386,32 @@
         </w:tc>
         <w:tc>
           <w:tcPr>
-            <w:tcW w:type="dxa" w:w="1478"/>
-            <w:tcBorders>
-              <w:top w:val="single" w:color="D9D9D9" w:sz="4"/>
-              <w:left w:val="single" w:color="D9D9D9" w:sz="4"/>
-              <w:bottom w:val="single" w:color="D9D9D9" w:sz="4"/>
-              <w:right w:val="single" w:color="D9D9D9" w:sz="4"/>
-            </w:tcBorders>
-            <w:tcMar>
-              <w:top w:type="dxa" w:w="70"/>
-              <w:left w:type="dxa" w:w="80"/>
-              <w:bottom w:type="dxa" w:w="70"/>
-              <w:right w:type="dxa" w:w="80"/>
-            </w:tcMar>
-          </w:tcPr>
-          <w:p>
-            <w:pPr>
-              <w:keepNext w:val="false"/>
-              <w:spacing w:after="0" w:line="240"/>
-            </w:pPr>
-            <w:r>
-              <w:rPr>
-                <w:rFonts w:ascii="Times New Roman" w:cs="Times New Roman" w:eastAsia="Times New Roman" w:hAnsi="Times New Roman"/>
-                <w:sz w:val="22"/>
-                <w:szCs w:val="22"/>
-              </w:rPr>
-              <w:t xml:space="preserve">Admitted; tender</w:t>
+            <w:tcW w:type="dxa" w:w="1698"/>
+            <w:tcBorders>
+              <w:top w:val="single" w:color="D9D9D9" w:sz="4"/>
+              <w:left w:val="single" w:color="D9D9D9" w:sz="4"/>
+              <w:bottom w:val="single" w:color="D9D9D9" w:sz="4"/>
+              <w:right w:val="single" w:color="D9D9D9" w:sz="4"/>
+            </w:tcBorders>
+            <w:tcMar>
+              <w:top w:type="dxa" w:w="70"/>
+              <w:left w:type="dxa" w:w="80"/>
+              <w:bottom w:type="dxa" w:w="70"/>
+              <w:right w:type="dxa" w:w="80"/>
+            </w:tcMar>
+          </w:tcPr>
+          <w:p>
+            <w:pPr>
+              <w:keepNext w:val="false"/>
+              <w:spacing w:after="0" w:line="240"/>
+            </w:pPr>
+            <w:r>
+              <w:rPr>
+                <w:rFonts w:ascii="Times New Roman" w:cs="Times New Roman" w:eastAsia="Times New Roman" w:hAnsi="Times New Roman"/>
+                <w:sz w:val="22"/>
+                <w:szCs w:val="22"/>
+              </w:rPr>
+              <w:t xml:space="preserve">Admitted; tender proposed</w:t>
             </w:r>
           </w:p>
         </w:tc>
@@ -4454,7 +4454,7 @@
         </w:tc>
         <w:tc>
           <w:tcPr>
-            <w:tcW w:type="dxa" w:w="2400"/>
+            <w:tcW w:type="dxa" w:w="2340"/>
             <w:tcBorders>
               <w:top w:val="single" w:color="D9D9D9" w:sz="4"/>
               <w:left w:val="single" w:color="D9D9D9" w:sz="4"/>
@@ -4547,7 +4547,7 @@
         </w:tc>
         <w:tc>
           <w:tcPr>
-            <w:tcW w:type="dxa" w:w="1560"/>
+            <w:tcW w:type="dxa" w:w="1540"/>
             <w:tcBorders>
               <w:top w:val="single" w:color="D9D9D9" w:sz="4"/>
               <w:left w:val="single" w:color="D9D9D9" w:sz="4"/>
@@ -4578,7 +4578,7 @@
         </w:tc>
         <w:tc>
           <w:tcPr>
-            <w:tcW w:type="dxa" w:w="1440"/>
+            <w:tcW w:type="dxa" w:w="1300"/>
             <w:tcBorders>
               <w:top w:val="single" w:color="D9D9D9" w:sz="4"/>
               <w:left w:val="single" w:color="D9D9D9" w:sz="4"/>
@@ -4609,32 +4609,32 @@
         </w:tc>
         <w:tc>
           <w:tcPr>
-            <w:tcW w:type="dxa" w:w="1478"/>
-            <w:tcBorders>
-              <w:top w:val="single" w:color="D9D9D9" w:sz="4"/>
-              <w:left w:val="single" w:color="D9D9D9" w:sz="4"/>
-              <w:bottom w:val="single" w:color="D9D9D9" w:sz="4"/>
-              <w:right w:val="single" w:color="D9D9D9" w:sz="4"/>
-            </w:tcBorders>
-            <w:tcMar>
-              <w:top w:type="dxa" w:w="70"/>
-              <w:left w:type="dxa" w:w="80"/>
-              <w:bottom w:type="dxa" w:w="70"/>
-              <w:right w:type="dxa" w:w="80"/>
-            </w:tcMar>
-          </w:tcPr>
-          <w:p>
-            <w:pPr>
-              <w:keepNext w:val="false"/>
-              <w:spacing w:after="0" w:line="240"/>
-            </w:pPr>
-            <w:r>
-              <w:rPr>
-                <w:rFonts w:ascii="Times New Roman" w:cs="Times New Roman" w:eastAsia="Times New Roman" w:hAnsi="Times New Roman"/>
-                <w:sz w:val="22"/>
-                <w:szCs w:val="22"/>
-              </w:rPr>
-              <w:t xml:space="preserve">Admitted; tender</w:t>
+            <w:tcW w:type="dxa" w:w="1698"/>
+            <w:tcBorders>
+              <w:top w:val="single" w:color="D9D9D9" w:sz="4"/>
+              <w:left w:val="single" w:color="D9D9D9" w:sz="4"/>
+              <w:bottom w:val="single" w:color="D9D9D9" w:sz="4"/>
+              <w:right w:val="single" w:color="D9D9D9" w:sz="4"/>
+            </w:tcBorders>
+            <w:tcMar>
+              <w:top w:type="dxa" w:w="70"/>
+              <w:left w:type="dxa" w:w="80"/>
+              <w:bottom w:type="dxa" w:w="70"/>
+              <w:right w:type="dxa" w:w="80"/>
+            </w:tcMar>
+          </w:tcPr>
+          <w:p>
+            <w:pPr>
+              <w:keepNext w:val="false"/>
+              <w:spacing w:after="0" w:line="240"/>
+            </w:pPr>
+            <w:r>
+              <w:rPr>
+                <w:rFonts w:ascii="Times New Roman" w:cs="Times New Roman" w:eastAsia="Times New Roman" w:hAnsi="Times New Roman"/>
+                <w:sz w:val="22"/>
+                <w:szCs w:val="22"/>
+              </w:rPr>
+              <w:t xml:space="preserve">Admitted; tender proposed</w:t>
             </w:r>
           </w:p>
         </w:tc>
@@ -4677,7 +4677,7 @@
         </w:tc>
         <w:tc>
           <w:tcPr>
-            <w:tcW w:type="dxa" w:w="2400"/>
+            <w:tcW w:type="dxa" w:w="2340"/>
             <w:tcBorders>
               <w:top w:val="single" w:color="D9D9D9" w:sz="4"/>
               <w:left w:val="single" w:color="D9D9D9" w:sz="4"/>
@@ -4770,7 +4770,7 @@
         </w:tc>
         <w:tc>
           <w:tcPr>
-            <w:tcW w:type="dxa" w:w="1560"/>
+            <w:tcW w:type="dxa" w:w="1540"/>
             <w:tcBorders>
               <w:top w:val="single" w:color="D9D9D9" w:sz="4"/>
               <w:left w:val="single" w:color="D9D9D9" w:sz="4"/>
@@ -4801,7 +4801,7 @@
         </w:tc>
         <w:tc>
           <w:tcPr>
-            <w:tcW w:type="dxa" w:w="1440"/>
+            <w:tcW w:type="dxa" w:w="1300"/>
             <w:tcBorders>
               <w:top w:val="single" w:color="D9D9D9" w:sz="4"/>
               <w:left w:val="single" w:color="D9D9D9" w:sz="4"/>
@@ -4832,32 +4832,32 @@
         </w:tc>
         <w:tc>
           <w:tcPr>
-            <w:tcW w:type="dxa" w:w="1478"/>
-            <w:tcBorders>
-              <w:top w:val="single" w:color="D9D9D9" w:sz="4"/>
-              <w:left w:val="single" w:color="D9D9D9" w:sz="4"/>
-              <w:bottom w:val="single" w:color="D9D9D9" w:sz="4"/>
-              <w:right w:val="single" w:color="D9D9D9" w:sz="4"/>
-            </w:tcBorders>
-            <w:tcMar>
-              <w:top w:type="dxa" w:w="70"/>
-              <w:left w:type="dxa" w:w="80"/>
-              <w:bottom w:type="dxa" w:w="70"/>
-              <w:right w:type="dxa" w:w="80"/>
-            </w:tcMar>
-          </w:tcPr>
-          <w:p>
-            <w:pPr>
-              <w:keepNext w:val="false"/>
-              <w:spacing w:after="0" w:line="240"/>
-            </w:pPr>
-            <w:r>
-              <w:rPr>
-                <w:rFonts w:ascii="Times New Roman" w:cs="Times New Roman" w:eastAsia="Times New Roman" w:hAnsi="Times New Roman"/>
-                <w:sz w:val="22"/>
-                <w:szCs w:val="22"/>
-              </w:rPr>
-              <w:t xml:space="preserve">Admitted; tender</w:t>
+            <w:tcW w:type="dxa" w:w="1698"/>
+            <w:tcBorders>
+              <w:top w:val="single" w:color="D9D9D9" w:sz="4"/>
+              <w:left w:val="single" w:color="D9D9D9" w:sz="4"/>
+              <w:bottom w:val="single" w:color="D9D9D9" w:sz="4"/>
+              <w:right w:val="single" w:color="D9D9D9" w:sz="4"/>
+            </w:tcBorders>
+            <w:tcMar>
+              <w:top w:type="dxa" w:w="70"/>
+              <w:left w:type="dxa" w:w="80"/>
+              <w:bottom w:type="dxa" w:w="70"/>
+              <w:right w:type="dxa" w:w="80"/>
+            </w:tcMar>
+          </w:tcPr>
+          <w:p>
+            <w:pPr>
+              <w:keepNext w:val="false"/>
+              <w:spacing w:after="0" w:line="240"/>
+            </w:pPr>
+            <w:r>
+              <w:rPr>
+                <w:rFonts w:ascii="Times New Roman" w:cs="Times New Roman" w:eastAsia="Times New Roman" w:hAnsi="Times New Roman"/>
+                <w:sz w:val="22"/>
+                <w:szCs w:val="22"/>
+              </w:rPr>
+              <w:t xml:space="preserve">Admitted; tender proposed</w:t>
             </w:r>
           </w:p>
         </w:tc>
@@ -4900,7 +4900,7 @@
         </w:tc>
         <w:tc>
           <w:tcPr>
-            <w:tcW w:type="dxa" w:w="2400"/>
+            <w:tcW w:type="dxa" w:w="2340"/>
             <w:tcBorders>
               <w:top w:val="single" w:color="D9D9D9" w:sz="4"/>
               <w:left w:val="single" w:color="D9D9D9" w:sz="4"/>
@@ -4993,7 +4993,7 @@
         </w:tc>
         <w:tc>
           <w:tcPr>
-            <w:tcW w:type="dxa" w:w="1560"/>
+            <w:tcW w:type="dxa" w:w="1540"/>
             <w:tcBorders>
               <w:top w:val="single" w:color="D9D9D9" w:sz="4"/>
               <w:left w:val="single" w:color="D9D9D9" w:sz="4"/>
@@ -5024,7 +5024,7 @@
         </w:tc>
         <w:tc>
           <w:tcPr>
-            <w:tcW w:type="dxa" w:w="1440"/>
+            <w:tcW w:type="dxa" w:w="1300"/>
             <w:tcBorders>
               <w:top w:val="single" w:color="D9D9D9" w:sz="4"/>
               <w:left w:val="single" w:color="D9D9D9" w:sz="4"/>
@@ -5055,32 +5055,32 @@
         </w:tc>
         <w:tc>
           <w:tcPr>
-            <w:tcW w:type="dxa" w:w="1478"/>
-            <w:tcBorders>
-              <w:top w:val="single" w:color="D9D9D9" w:sz="4"/>
-              <w:left w:val="single" w:color="D9D9D9" w:sz="4"/>
-              <w:bottom w:val="single" w:color="D9D9D9" w:sz="4"/>
-              <w:right w:val="single" w:color="D9D9D9" w:sz="4"/>
-            </w:tcBorders>
-            <w:tcMar>
-              <w:top w:type="dxa" w:w="70"/>
-              <w:left w:type="dxa" w:w="80"/>
-              <w:bottom w:type="dxa" w:w="70"/>
-              <w:right w:type="dxa" w:w="80"/>
-            </w:tcMar>
-          </w:tcPr>
-          <w:p>
-            <w:pPr>
-              <w:keepNext w:val="false"/>
-              <w:spacing w:after="0" w:line="240"/>
-            </w:pPr>
-            <w:r>
-              <w:rPr>
-                <w:rFonts w:ascii="Times New Roman" w:cs="Times New Roman" w:eastAsia="Times New Roman" w:hAnsi="Times New Roman"/>
-                <w:sz w:val="22"/>
-                <w:szCs w:val="22"/>
-              </w:rPr>
-              <w:t xml:space="preserve">Admitted; tender</w:t>
+            <w:tcW w:type="dxa" w:w="1698"/>
+            <w:tcBorders>
+              <w:top w:val="single" w:color="D9D9D9" w:sz="4"/>
+              <w:left w:val="single" w:color="D9D9D9" w:sz="4"/>
+              <w:bottom w:val="single" w:color="D9D9D9" w:sz="4"/>
+              <w:right w:val="single" w:color="D9D9D9" w:sz="4"/>
+            </w:tcBorders>
+            <w:tcMar>
+              <w:top w:type="dxa" w:w="70"/>
+              <w:left w:type="dxa" w:w="80"/>
+              <w:bottom w:type="dxa" w:w="70"/>
+              <w:right w:type="dxa" w:w="80"/>
+            </w:tcMar>
+          </w:tcPr>
+          <w:p>
+            <w:pPr>
+              <w:keepNext w:val="false"/>
+              <w:spacing w:after="0" w:line="240"/>
+            </w:pPr>
+            <w:r>
+              <w:rPr>
+                <w:rFonts w:ascii="Times New Roman" w:cs="Times New Roman" w:eastAsia="Times New Roman" w:hAnsi="Times New Roman"/>
+                <w:sz w:val="22"/>
+                <w:szCs w:val="22"/>
+              </w:rPr>
+              <w:t xml:space="preserve">Admitted; tender proposed</w:t>
             </w:r>
           </w:p>
         </w:tc>
@@ -5123,7 +5123,7 @@
         </w:tc>
         <w:tc>
           <w:tcPr>
-            <w:tcW w:type="dxa" w:w="2400"/>
+            <w:tcW w:type="dxa" w:w="2340"/>
             <w:tcBorders>
               <w:top w:val="single" w:color="D9D9D9" w:sz="4"/>
               <w:left w:val="single" w:color="D9D9D9" w:sz="4"/>
@@ -5216,7 +5216,7 @@
         </w:tc>
         <w:tc>
           <w:tcPr>
-            <w:tcW w:type="dxa" w:w="1560"/>
+            <w:tcW w:type="dxa" w:w="1540"/>
             <w:tcBorders>
               <w:top w:val="single" w:color="D9D9D9" w:sz="4"/>
               <w:left w:val="single" w:color="D9D9D9" w:sz="4"/>
@@ -5247,7 +5247,7 @@
         </w:tc>
         <w:tc>
           <w:tcPr>
-            <w:tcW w:type="dxa" w:w="1440"/>
+            <w:tcW w:type="dxa" w:w="1300"/>
             <w:tcBorders>
               <w:top w:val="single" w:color="D9D9D9" w:sz="4"/>
               <w:left w:val="single" w:color="D9D9D9" w:sz="4"/>
@@ -5278,32 +5278,32 @@
         </w:tc>
         <w:tc>
           <w:tcPr>
-            <w:tcW w:type="dxa" w:w="1478"/>
-            <w:tcBorders>
-              <w:top w:val="single" w:color="D9D9D9" w:sz="4"/>
-              <w:left w:val="single" w:color="D9D9D9" w:sz="4"/>
-              <w:bottom w:val="single" w:color="D9D9D9" w:sz="4"/>
-              <w:right w:val="single" w:color="D9D9D9" w:sz="4"/>
-            </w:tcBorders>
-            <w:tcMar>
-              <w:top w:type="dxa" w:w="70"/>
-              <w:left w:type="dxa" w:w="80"/>
-              <w:bottom w:type="dxa" w:w="70"/>
-              <w:right w:type="dxa" w:w="80"/>
-            </w:tcMar>
-          </w:tcPr>
-          <w:p>
-            <w:pPr>
-              <w:keepNext w:val="false"/>
-              <w:spacing w:after="0" w:line="240"/>
-            </w:pPr>
-            <w:r>
-              <w:rPr>
-                <w:rFonts w:ascii="Times New Roman" w:cs="Times New Roman" w:eastAsia="Times New Roman" w:hAnsi="Times New Roman"/>
-                <w:sz w:val="22"/>
-                <w:szCs w:val="22"/>
-              </w:rPr>
-              <w:t xml:space="preserve">Admitted; tender</w:t>
+            <w:tcW w:type="dxa" w:w="1698"/>
+            <w:tcBorders>
+              <w:top w:val="single" w:color="D9D9D9" w:sz="4"/>
+              <w:left w:val="single" w:color="D9D9D9" w:sz="4"/>
+              <w:bottom w:val="single" w:color="D9D9D9" w:sz="4"/>
+              <w:right w:val="single" w:color="D9D9D9" w:sz="4"/>
+            </w:tcBorders>
+            <w:tcMar>
+              <w:top w:type="dxa" w:w="70"/>
+              <w:left w:type="dxa" w:w="80"/>
+              <w:bottom w:type="dxa" w:w="70"/>
+              <w:right w:type="dxa" w:w="80"/>
+            </w:tcMar>
+          </w:tcPr>
+          <w:p>
+            <w:pPr>
+              <w:keepNext w:val="false"/>
+              <w:spacing w:after="0" w:line="240"/>
+            </w:pPr>
+            <w:r>
+              <w:rPr>
+                <w:rFonts w:ascii="Times New Roman" w:cs="Times New Roman" w:eastAsia="Times New Roman" w:hAnsi="Times New Roman"/>
+                <w:sz w:val="22"/>
+                <w:szCs w:val="22"/>
+              </w:rPr>
+              <w:t xml:space="preserve">Admitted; tender proposed</w:t>
             </w:r>
           </w:p>
         </w:tc>
@@ -5346,7 +5346,7 @@
         </w:tc>
         <w:tc>
           <w:tcPr>
-            <w:tcW w:type="dxa" w:w="2400"/>
+            <w:tcW w:type="dxa" w:w="2340"/>
             <w:tcBorders>
               <w:top w:val="single" w:color="D9D9D9" w:sz="4"/>
               <w:left w:val="single" w:color="D9D9D9" w:sz="4"/>
@@ -5439,7 +5439,7 @@
         </w:tc>
         <w:tc>
           <w:tcPr>
-            <w:tcW w:type="dxa" w:w="1560"/>
+            <w:tcW w:type="dxa" w:w="1540"/>
             <w:tcBorders>
               <w:top w:val="single" w:color="D9D9D9" w:sz="4"/>
               <w:left w:val="single" w:color="D9D9D9" w:sz="4"/>
@@ -5470,7 +5470,7 @@
         </w:tc>
         <w:tc>
           <w:tcPr>
-            <w:tcW w:type="dxa" w:w="1440"/>
+            <w:tcW w:type="dxa" w:w="1300"/>
             <w:tcBorders>
               <w:top w:val="single" w:color="D9D9D9" w:sz="4"/>
               <w:left w:val="single" w:color="D9D9D9" w:sz="4"/>
@@ -5501,32 +5501,32 @@
         </w:tc>
         <w:tc>
           <w:tcPr>
-            <w:tcW w:type="dxa" w:w="1478"/>
-            <w:tcBorders>
-              <w:top w:val="single" w:color="D9D9D9" w:sz="4"/>
-              <w:left w:val="single" w:color="D9D9D9" w:sz="4"/>
-              <w:bottom w:val="single" w:color="D9D9D9" w:sz="4"/>
-              <w:right w:val="single" w:color="D9D9D9" w:sz="4"/>
-            </w:tcBorders>
-            <w:tcMar>
-              <w:top w:type="dxa" w:w="70"/>
-              <w:left w:type="dxa" w:w="80"/>
-              <w:bottom w:type="dxa" w:w="70"/>
-              <w:right w:type="dxa" w:w="80"/>
-            </w:tcMar>
-          </w:tcPr>
-          <w:p>
-            <w:pPr>
-              <w:keepNext w:val="false"/>
-              <w:spacing w:after="0" w:line="240"/>
-            </w:pPr>
-            <w:r>
-              <w:rPr>
-                <w:rFonts w:ascii="Times New Roman" w:cs="Times New Roman" w:eastAsia="Times New Roman" w:hAnsi="Times New Roman"/>
-                <w:sz w:val="22"/>
-                <w:szCs w:val="22"/>
-              </w:rPr>
-              <w:t xml:space="preserve">Admitted; tender</w:t>
+            <w:tcW w:type="dxa" w:w="1698"/>
+            <w:tcBorders>
+              <w:top w:val="single" w:color="D9D9D9" w:sz="4"/>
+              <w:left w:val="single" w:color="D9D9D9" w:sz="4"/>
+              <w:bottom w:val="single" w:color="D9D9D9" w:sz="4"/>
+              <w:right w:val="single" w:color="D9D9D9" w:sz="4"/>
+            </w:tcBorders>
+            <w:tcMar>
+              <w:top w:type="dxa" w:w="70"/>
+              <w:left w:type="dxa" w:w="80"/>
+              <w:bottom w:type="dxa" w:w="70"/>
+              <w:right w:type="dxa" w:w="80"/>
+            </w:tcMar>
+          </w:tcPr>
+          <w:p>
+            <w:pPr>
+              <w:keepNext w:val="false"/>
+              <w:spacing w:after="0" w:line="240"/>
+            </w:pPr>
+            <w:r>
+              <w:rPr>
+                <w:rFonts w:ascii="Times New Roman" w:cs="Times New Roman" w:eastAsia="Times New Roman" w:hAnsi="Times New Roman"/>
+                <w:sz w:val="22"/>
+                <w:szCs w:val="22"/>
+              </w:rPr>
+              <w:t xml:space="preserve">Admitted; tender proposed</w:t>
             </w:r>
           </w:p>
         </w:tc>
@@ -5569,7 +5569,7 @@
         </w:tc>
         <w:tc>
           <w:tcPr>
-            <w:tcW w:type="dxa" w:w="2400"/>
+            <w:tcW w:type="dxa" w:w="2340"/>
             <w:tcBorders>
               <w:top w:val="single" w:color="D9D9D9" w:sz="4"/>
               <w:left w:val="single" w:color="D9D9D9" w:sz="4"/>
@@ -5662,7 +5662,7 @@
         </w:tc>
         <w:tc>
           <w:tcPr>
-            <w:tcW w:type="dxa" w:w="1560"/>
+            <w:tcW w:type="dxa" w:w="1540"/>
             <w:tcBorders>
               <w:top w:val="single" w:color="D9D9D9" w:sz="4"/>
               <w:left w:val="single" w:color="D9D9D9" w:sz="4"/>
@@ -5693,7 +5693,7 @@
         </w:tc>
         <w:tc>
           <w:tcPr>
-            <w:tcW w:type="dxa" w:w="1440"/>
+            <w:tcW w:type="dxa" w:w="1300"/>
             <w:tcBorders>
               <w:top w:val="single" w:color="D9D9D9" w:sz="4"/>
               <w:left w:val="single" w:color="D9D9D9" w:sz="4"/>
@@ -5724,32 +5724,32 @@
         </w:tc>
         <w:tc>
           <w:tcPr>
-            <w:tcW w:type="dxa" w:w="1478"/>
-            <w:tcBorders>
-              <w:top w:val="single" w:color="D9D9D9" w:sz="4"/>
-              <w:left w:val="single" w:color="D9D9D9" w:sz="4"/>
-              <w:bottom w:val="single" w:color="D9D9D9" w:sz="4"/>
-              <w:right w:val="single" w:color="D9D9D9" w:sz="4"/>
-            </w:tcBorders>
-            <w:tcMar>
-              <w:top w:type="dxa" w:w="70"/>
-              <w:left w:type="dxa" w:w="80"/>
-              <w:bottom w:type="dxa" w:w="70"/>
-              <w:right w:type="dxa" w:w="80"/>
-            </w:tcMar>
-          </w:tcPr>
-          <w:p>
-            <w:pPr>
-              <w:keepNext w:val="false"/>
-              <w:spacing w:after="0" w:line="240"/>
-            </w:pPr>
-            <w:r>
-              <w:rPr>
-                <w:rFonts w:ascii="Times New Roman" w:cs="Times New Roman" w:eastAsia="Times New Roman" w:hAnsi="Times New Roman"/>
-                <w:sz w:val="22"/>
-                <w:szCs w:val="22"/>
-              </w:rPr>
-              <w:t xml:space="preserve">Admitted; tender</w:t>
+            <w:tcW w:type="dxa" w:w="1698"/>
+            <w:tcBorders>
+              <w:top w:val="single" w:color="D9D9D9" w:sz="4"/>
+              <w:left w:val="single" w:color="D9D9D9" w:sz="4"/>
+              <w:bottom w:val="single" w:color="D9D9D9" w:sz="4"/>
+              <w:right w:val="single" w:color="D9D9D9" w:sz="4"/>
+            </w:tcBorders>
+            <w:tcMar>
+              <w:top w:type="dxa" w:w="70"/>
+              <w:left w:type="dxa" w:w="80"/>
+              <w:bottom w:type="dxa" w:w="70"/>
+              <w:right w:type="dxa" w:w="80"/>
+            </w:tcMar>
+          </w:tcPr>
+          <w:p>
+            <w:pPr>
+              <w:keepNext w:val="false"/>
+              <w:spacing w:after="0" w:line="240"/>
+            </w:pPr>
+            <w:r>
+              <w:rPr>
+                <w:rFonts w:ascii="Times New Roman" w:cs="Times New Roman" w:eastAsia="Times New Roman" w:hAnsi="Times New Roman"/>
+                <w:sz w:val="22"/>
+                <w:szCs w:val="22"/>
+              </w:rPr>
+              <w:t xml:space="preserve">Admitted; tender proposed</w:t>
             </w:r>
           </w:p>
         </w:tc>
@@ -5792,7 +5792,7 @@
         </w:tc>
         <w:tc>
           <w:tcPr>
-            <w:tcW w:type="dxa" w:w="2400"/>
+            <w:tcW w:type="dxa" w:w="2340"/>
             <w:tcBorders>
               <w:top w:val="single" w:color="D9D9D9" w:sz="4"/>
               <w:left w:val="single" w:color="D9D9D9" w:sz="4"/>
@@ -5885,7 +5885,7 @@
         </w:tc>
         <w:tc>
           <w:tcPr>
-            <w:tcW w:type="dxa" w:w="1560"/>
+            <w:tcW w:type="dxa" w:w="1540"/>
             <w:tcBorders>
               <w:top w:val="single" w:color="D9D9D9" w:sz="4"/>
               <w:left w:val="single" w:color="D9D9D9" w:sz="4"/>
@@ -5916,7 +5916,7 @@
         </w:tc>
         <w:tc>
           <w:tcPr>
-            <w:tcW w:type="dxa" w:w="1440"/>
+            <w:tcW w:type="dxa" w:w="1300"/>
             <w:tcBorders>
               <w:top w:val="single" w:color="D9D9D9" w:sz="4"/>
               <w:left w:val="single" w:color="D9D9D9" w:sz="4"/>
@@ -5947,32 +5947,32 @@
         </w:tc>
         <w:tc>
           <w:tcPr>
-            <w:tcW w:type="dxa" w:w="1478"/>
-            <w:tcBorders>
-              <w:top w:val="single" w:color="D9D9D9" w:sz="4"/>
-              <w:left w:val="single" w:color="D9D9D9" w:sz="4"/>
-              <w:bottom w:val="single" w:color="D9D9D9" w:sz="4"/>
-              <w:right w:val="single" w:color="D9D9D9" w:sz="4"/>
-            </w:tcBorders>
-            <w:tcMar>
-              <w:top w:type="dxa" w:w="70"/>
-              <w:left w:type="dxa" w:w="80"/>
-              <w:bottom w:type="dxa" w:w="70"/>
-              <w:right w:type="dxa" w:w="80"/>
-            </w:tcMar>
-          </w:tcPr>
-          <w:p>
-            <w:pPr>
-              <w:keepNext w:val="false"/>
-              <w:spacing w:after="0" w:line="240"/>
-            </w:pPr>
-            <w:r>
-              <w:rPr>
-                <w:rFonts w:ascii="Times New Roman" w:cs="Times New Roman" w:eastAsia="Times New Roman" w:hAnsi="Times New Roman"/>
-                <w:sz w:val="22"/>
-                <w:szCs w:val="22"/>
-              </w:rPr>
-              <w:t xml:space="preserve">Admitted; tender</w:t>
+            <w:tcW w:type="dxa" w:w="1698"/>
+            <w:tcBorders>
+              <w:top w:val="single" w:color="D9D9D9" w:sz="4"/>
+              <w:left w:val="single" w:color="D9D9D9" w:sz="4"/>
+              <w:bottom w:val="single" w:color="D9D9D9" w:sz="4"/>
+              <w:right w:val="single" w:color="D9D9D9" w:sz="4"/>
+            </w:tcBorders>
+            <w:tcMar>
+              <w:top w:type="dxa" w:w="70"/>
+              <w:left w:type="dxa" w:w="80"/>
+              <w:bottom w:type="dxa" w:w="70"/>
+              <w:right w:type="dxa" w:w="80"/>
+            </w:tcMar>
+          </w:tcPr>
+          <w:p>
+            <w:pPr>
+              <w:keepNext w:val="false"/>
+              <w:spacing w:after="0" w:line="240"/>
+            </w:pPr>
+            <w:r>
+              <w:rPr>
+                <w:rFonts w:ascii="Times New Roman" w:cs="Times New Roman" w:eastAsia="Times New Roman" w:hAnsi="Times New Roman"/>
+                <w:sz w:val="22"/>
+                <w:szCs w:val="22"/>
+              </w:rPr>
+              <w:t xml:space="preserve">Admitted; tender proposed</w:t>
             </w:r>
           </w:p>
         </w:tc>
@@ -6015,7 +6015,7 @@
         </w:tc>
         <w:tc>
           <w:tcPr>
-            <w:tcW w:type="dxa" w:w="2400"/>
+            <w:tcW w:type="dxa" w:w="2340"/>
             <w:tcBorders>
               <w:top w:val="single" w:color="D9D9D9" w:sz="4"/>
               <w:left w:val="single" w:color="D9D9D9" w:sz="4"/>
@@ -6108,7 +6108,7 @@
         </w:tc>
         <w:tc>
           <w:tcPr>
-            <w:tcW w:type="dxa" w:w="1560"/>
+            <w:tcW w:type="dxa" w:w="1540"/>
             <w:tcBorders>
               <w:top w:val="single" w:color="D9D9D9" w:sz="4"/>
               <w:left w:val="single" w:color="D9D9D9" w:sz="4"/>
@@ -6139,7 +6139,7 @@
         </w:tc>
         <w:tc>
           <w:tcPr>
-            <w:tcW w:type="dxa" w:w="1440"/>
+            <w:tcW w:type="dxa" w:w="1300"/>
             <w:tcBorders>
               <w:top w:val="single" w:color="D9D9D9" w:sz="4"/>
               <w:left w:val="single" w:color="D9D9D9" w:sz="4"/>
@@ -6170,32 +6170,32 @@
         </w:tc>
         <w:tc>
           <w:tcPr>
-            <w:tcW w:type="dxa" w:w="1478"/>
-            <w:tcBorders>
-              <w:top w:val="single" w:color="D9D9D9" w:sz="4"/>
-              <w:left w:val="single" w:color="D9D9D9" w:sz="4"/>
-              <w:bottom w:val="single" w:color="D9D9D9" w:sz="4"/>
-              <w:right w:val="single" w:color="D9D9D9" w:sz="4"/>
-            </w:tcBorders>
-            <w:tcMar>
-              <w:top w:type="dxa" w:w="70"/>
-              <w:left w:type="dxa" w:w="80"/>
-              <w:bottom w:type="dxa" w:w="70"/>
-              <w:right w:type="dxa" w:w="80"/>
-            </w:tcMar>
-          </w:tcPr>
-          <w:p>
-            <w:pPr>
-              <w:keepNext w:val="false"/>
-              <w:spacing w:after="0" w:line="240"/>
-            </w:pPr>
-            <w:r>
-              <w:rPr>
-                <w:rFonts w:ascii="Times New Roman" w:cs="Times New Roman" w:eastAsia="Times New Roman" w:hAnsi="Times New Roman"/>
-                <w:sz w:val="22"/>
-                <w:szCs w:val="22"/>
-              </w:rPr>
-              <w:t xml:space="preserve">Admitted; tender</w:t>
+            <w:tcW w:type="dxa" w:w="1698"/>
+            <w:tcBorders>
+              <w:top w:val="single" w:color="D9D9D9" w:sz="4"/>
+              <w:left w:val="single" w:color="D9D9D9" w:sz="4"/>
+              <w:bottom w:val="single" w:color="D9D9D9" w:sz="4"/>
+              <w:right w:val="single" w:color="D9D9D9" w:sz="4"/>
+            </w:tcBorders>
+            <w:tcMar>
+              <w:top w:type="dxa" w:w="70"/>
+              <w:left w:type="dxa" w:w="80"/>
+              <w:bottom w:type="dxa" w:w="70"/>
+              <w:right w:type="dxa" w:w="80"/>
+            </w:tcMar>
+          </w:tcPr>
+          <w:p>
+            <w:pPr>
+              <w:keepNext w:val="false"/>
+              <w:spacing w:after="0" w:line="240"/>
+            </w:pPr>
+            <w:r>
+              <w:rPr>
+                <w:rFonts w:ascii="Times New Roman" w:cs="Times New Roman" w:eastAsia="Times New Roman" w:hAnsi="Times New Roman"/>
+                <w:sz w:val="22"/>
+                <w:szCs w:val="22"/>
+              </w:rPr>
+              <w:t xml:space="preserve">Admitted; tender proposed</w:t>
             </w:r>
           </w:p>
         </w:tc>
@@ -6238,7 +6238,7 @@
         </w:tc>
         <w:tc>
           <w:tcPr>
-            <w:tcW w:type="dxa" w:w="2400"/>
+            <w:tcW w:type="dxa" w:w="2340"/>
             <w:tcBorders>
               <w:top w:val="single" w:color="D9D9D9" w:sz="4"/>
               <w:left w:val="single" w:color="D9D9D9" w:sz="4"/>
@@ -6331,7 +6331,7 @@
         </w:tc>
         <w:tc>
           <w:tcPr>
-            <w:tcW w:type="dxa" w:w="1560"/>
+            <w:tcW w:type="dxa" w:w="1540"/>
             <w:tcBorders>
               <w:top w:val="single" w:color="D9D9D9" w:sz="4"/>
               <w:left w:val="single" w:color="D9D9D9" w:sz="4"/>
@@ -6362,7 +6362,7 @@
         </w:tc>
         <w:tc>
           <w:tcPr>
-            <w:tcW w:type="dxa" w:w="1440"/>
+            <w:tcW w:type="dxa" w:w="1300"/>
             <w:tcBorders>
               <w:top w:val="single" w:color="D9D9D9" w:sz="4"/>
               <w:left w:val="single" w:color="D9D9D9" w:sz="4"/>
@@ -6393,32 +6393,32 @@
         </w:tc>
         <w:tc>
           <w:tcPr>
-            <w:tcW w:type="dxa" w:w="1478"/>
-            <w:tcBorders>
-              <w:top w:val="single" w:color="D9D9D9" w:sz="4"/>
-              <w:left w:val="single" w:color="D9D9D9" w:sz="4"/>
-              <w:bottom w:val="single" w:color="D9D9D9" w:sz="4"/>
-              <w:right w:val="single" w:color="D9D9D9" w:sz="4"/>
-            </w:tcBorders>
-            <w:tcMar>
-              <w:top w:type="dxa" w:w="70"/>
-              <w:left w:type="dxa" w:w="80"/>
-              <w:bottom w:type="dxa" w:w="70"/>
-              <w:right w:type="dxa" w:w="80"/>
-            </w:tcMar>
-          </w:tcPr>
-          <w:p>
-            <w:pPr>
-              <w:keepNext w:val="false"/>
-              <w:spacing w:after="0" w:line="240"/>
-            </w:pPr>
-            <w:r>
-              <w:rPr>
-                <w:rFonts w:ascii="Times New Roman" w:cs="Times New Roman" w:eastAsia="Times New Roman" w:hAnsi="Times New Roman"/>
-                <w:sz w:val="22"/>
-                <w:szCs w:val="22"/>
-              </w:rPr>
-              <w:t xml:space="preserve">Admitted; tender</w:t>
+            <w:tcW w:type="dxa" w:w="1698"/>
+            <w:tcBorders>
+              <w:top w:val="single" w:color="D9D9D9" w:sz="4"/>
+              <w:left w:val="single" w:color="D9D9D9" w:sz="4"/>
+              <w:bottom w:val="single" w:color="D9D9D9" w:sz="4"/>
+              <w:right w:val="single" w:color="D9D9D9" w:sz="4"/>
+            </w:tcBorders>
+            <w:tcMar>
+              <w:top w:type="dxa" w:w="70"/>
+              <w:left w:type="dxa" w:w="80"/>
+              <w:bottom w:type="dxa" w:w="70"/>
+              <w:right w:type="dxa" w:w="80"/>
+            </w:tcMar>
+          </w:tcPr>
+          <w:p>
+            <w:pPr>
+              <w:keepNext w:val="false"/>
+              <w:spacing w:after="0" w:line="240"/>
+            </w:pPr>
+            <w:r>
+              <w:rPr>
+                <w:rFonts w:ascii="Times New Roman" w:cs="Times New Roman" w:eastAsia="Times New Roman" w:hAnsi="Times New Roman"/>
+                <w:sz w:val="22"/>
+                <w:szCs w:val="22"/>
+              </w:rPr>
+              <w:t xml:space="preserve">Admitted; tender proposed</w:t>
             </w:r>
           </w:p>
         </w:tc>
@@ -6461,7 +6461,7 @@
         </w:tc>
         <w:tc>
           <w:tcPr>
-            <w:tcW w:type="dxa" w:w="2400"/>
+            <w:tcW w:type="dxa" w:w="2340"/>
             <w:tcBorders>
               <w:top w:val="single" w:color="D9D9D9" w:sz="4"/>
               <w:left w:val="single" w:color="D9D9D9" w:sz="4"/>
@@ -6554,7 +6554,7 @@
         </w:tc>
         <w:tc>
           <w:tcPr>
-            <w:tcW w:type="dxa" w:w="1560"/>
+            <w:tcW w:type="dxa" w:w="1540"/>
             <w:tcBorders>
               <w:top w:val="single" w:color="D9D9D9" w:sz="4"/>
               <w:left w:val="single" w:color="D9D9D9" w:sz="4"/>
@@ -6585,7 +6585,7 @@
         </w:tc>
         <w:tc>
           <w:tcPr>
-            <w:tcW w:type="dxa" w:w="1440"/>
+            <w:tcW w:type="dxa" w:w="1300"/>
             <w:tcBorders>
               <w:top w:val="single" w:color="D9D9D9" w:sz="4"/>
               <w:left w:val="single" w:color="D9D9D9" w:sz="4"/>
@@ -6616,32 +6616,32 @@
         </w:tc>
         <w:tc>
           <w:tcPr>
-            <w:tcW w:type="dxa" w:w="1478"/>
-            <w:tcBorders>
-              <w:top w:val="single" w:color="D9D9D9" w:sz="4"/>
-              <w:left w:val="single" w:color="D9D9D9" w:sz="4"/>
-              <w:bottom w:val="single" w:color="D9D9D9" w:sz="4"/>
-              <w:right w:val="single" w:color="D9D9D9" w:sz="4"/>
-            </w:tcBorders>
-            <w:tcMar>
-              <w:top w:type="dxa" w:w="70"/>
-              <w:left w:type="dxa" w:w="80"/>
-              <w:bottom w:type="dxa" w:w="70"/>
-              <w:right w:type="dxa" w:w="80"/>
-            </w:tcMar>
-          </w:tcPr>
-          <w:p>
-            <w:pPr>
-              <w:keepNext w:val="false"/>
-              <w:spacing w:after="0" w:line="240"/>
-            </w:pPr>
-            <w:r>
-              <w:rPr>
-                <w:rFonts w:ascii="Times New Roman" w:cs="Times New Roman" w:eastAsia="Times New Roman" w:hAnsi="Times New Roman"/>
-                <w:sz w:val="22"/>
-                <w:szCs w:val="22"/>
-              </w:rPr>
-              <w:t xml:space="preserve">Now admitted; tender</w:t>
+            <w:tcW w:type="dxa" w:w="1698"/>
+            <w:tcBorders>
+              <w:top w:val="single" w:color="D9D9D9" w:sz="4"/>
+              <w:left w:val="single" w:color="D9D9D9" w:sz="4"/>
+              <w:bottom w:val="single" w:color="D9D9D9" w:sz="4"/>
+              <w:right w:val="single" w:color="D9D9D9" w:sz="4"/>
+            </w:tcBorders>
+            <w:tcMar>
+              <w:top w:type="dxa" w:w="70"/>
+              <w:left w:type="dxa" w:w="80"/>
+              <w:bottom w:type="dxa" w:w="70"/>
+              <w:right w:type="dxa" w:w="80"/>
+            </w:tcMar>
+          </w:tcPr>
+          <w:p>
+            <w:pPr>
+              <w:keepNext w:val="false"/>
+              <w:spacing w:after="0" w:line="240"/>
+            </w:pPr>
+            <w:r>
+              <w:rPr>
+                <w:rFonts w:ascii="Times New Roman" w:cs="Times New Roman" w:eastAsia="Times New Roman" w:hAnsi="Times New Roman"/>
+                <w:sz w:val="22"/>
+                <w:szCs w:val="22"/>
+              </w:rPr>
+              <w:t xml:space="preserve">Veracity confirmed; tender proposed</w:t>
             </w:r>
           </w:p>
         </w:tc>
@@ -6684,7 +6684,7 @@
         </w:tc>
         <w:tc>
           <w:tcPr>
-            <w:tcW w:type="dxa" w:w="2400"/>
+            <w:tcW w:type="dxa" w:w="2340"/>
             <w:tcBorders>
               <w:top w:val="single" w:color="D9D9D9" w:sz="4"/>
               <w:left w:val="single" w:color="D9D9D9" w:sz="4"/>
@@ -6777,7 +6777,7 @@
         </w:tc>
         <w:tc>
           <w:tcPr>
-            <w:tcW w:type="dxa" w:w="1560"/>
+            <w:tcW w:type="dxa" w:w="1540"/>
             <w:tcBorders>
               <w:top w:val="single" w:color="D9D9D9" w:sz="4"/>
               <w:left w:val="single" w:color="D9D9D9" w:sz="4"/>
@@ -6808,7 +6808,7 @@
         </w:tc>
         <w:tc>
           <w:tcPr>
-            <w:tcW w:type="dxa" w:w="1440"/>
+            <w:tcW w:type="dxa" w:w="1300"/>
             <w:tcBorders>
               <w:top w:val="single" w:color="D9D9D9" w:sz="4"/>
               <w:left w:val="single" w:color="D9D9D9" w:sz="4"/>
@@ -6839,32 +6839,32 @@
         </w:tc>
         <w:tc>
           <w:tcPr>
-            <w:tcW w:type="dxa" w:w="1478"/>
-            <w:tcBorders>
-              <w:top w:val="single" w:color="D9D9D9" w:sz="4"/>
-              <w:left w:val="single" w:color="D9D9D9" w:sz="4"/>
-              <w:bottom w:val="single" w:color="D9D9D9" w:sz="4"/>
-              <w:right w:val="single" w:color="D9D9D9" w:sz="4"/>
-            </w:tcBorders>
-            <w:tcMar>
-              <w:top w:type="dxa" w:w="70"/>
-              <w:left w:type="dxa" w:w="80"/>
-              <w:bottom w:type="dxa" w:w="70"/>
-              <w:right w:type="dxa" w:w="80"/>
-            </w:tcMar>
-          </w:tcPr>
-          <w:p>
-            <w:pPr>
-              <w:keepNext w:val="false"/>
-              <w:spacing w:after="0" w:line="240"/>
-            </w:pPr>
-            <w:r>
-              <w:rPr>
-                <w:rFonts w:ascii="Times New Roman" w:cs="Times New Roman" w:eastAsia="Times New Roman" w:hAnsi="Times New Roman"/>
-                <w:sz w:val="22"/>
-                <w:szCs w:val="22"/>
-              </w:rPr>
-              <w:t xml:space="preserve">Now admitted; tender</w:t>
+            <w:tcW w:type="dxa" w:w="1698"/>
+            <w:tcBorders>
+              <w:top w:val="single" w:color="D9D9D9" w:sz="4"/>
+              <w:left w:val="single" w:color="D9D9D9" w:sz="4"/>
+              <w:bottom w:val="single" w:color="D9D9D9" w:sz="4"/>
+              <w:right w:val="single" w:color="D9D9D9" w:sz="4"/>
+            </w:tcBorders>
+            <w:tcMar>
+              <w:top w:type="dxa" w:w="70"/>
+              <w:left w:type="dxa" w:w="80"/>
+              <w:bottom w:type="dxa" w:w="70"/>
+              <w:right w:type="dxa" w:w="80"/>
+            </w:tcMar>
+          </w:tcPr>
+          <w:p>
+            <w:pPr>
+              <w:keepNext w:val="false"/>
+              <w:spacing w:after="0" w:line="240"/>
+            </w:pPr>
+            <w:r>
+              <w:rPr>
+                <w:rFonts w:ascii="Times New Roman" w:cs="Times New Roman" w:eastAsia="Times New Roman" w:hAnsi="Times New Roman"/>
+                <w:sz w:val="22"/>
+                <w:szCs w:val="22"/>
+              </w:rPr>
+              <w:t xml:space="preserve">Veracity confirmed; tender proposed</w:t>
             </w:r>
           </w:p>
         </w:tc>
@@ -6907,7 +6907,7 @@
         </w:tc>
         <w:tc>
           <w:tcPr>
-            <w:tcW w:type="dxa" w:w="2400"/>
+            <w:tcW w:type="dxa" w:w="2340"/>
             <w:tcBorders>
               <w:top w:val="single" w:color="D9D9D9" w:sz="4"/>
               <w:left w:val="single" w:color="D9D9D9" w:sz="4"/>
@@ -7000,7 +7000,7 @@
         </w:tc>
         <w:tc>
           <w:tcPr>
-            <w:tcW w:type="dxa" w:w="1560"/>
+            <w:tcW w:type="dxa" w:w="1540"/>
             <w:tcBorders>
               <w:top w:val="single" w:color="D9D9D9" w:sz="4"/>
               <w:left w:val="single" w:color="D9D9D9" w:sz="4"/>
@@ -7031,7 +7031,7 @@
         </w:tc>
         <w:tc>
           <w:tcPr>
-            <w:tcW w:type="dxa" w:w="1440"/>
+            <w:tcW w:type="dxa" w:w="1300"/>
             <w:tcBorders>
               <w:top w:val="single" w:color="D9D9D9" w:sz="4"/>
               <w:left w:val="single" w:color="D9D9D9" w:sz="4"/>
@@ -7062,32 +7062,32 @@
         </w:tc>
         <w:tc>
           <w:tcPr>
-            <w:tcW w:type="dxa" w:w="1478"/>
-            <w:tcBorders>
-              <w:top w:val="single" w:color="D9D9D9" w:sz="4"/>
-              <w:left w:val="single" w:color="D9D9D9" w:sz="4"/>
-              <w:bottom w:val="single" w:color="D9D9D9" w:sz="4"/>
-              <w:right w:val="single" w:color="D9D9D9" w:sz="4"/>
-            </w:tcBorders>
-            <w:tcMar>
-              <w:top w:type="dxa" w:w="70"/>
-              <w:left w:type="dxa" w:w="80"/>
-              <w:bottom w:type="dxa" w:w="70"/>
-              <w:right w:type="dxa" w:w="80"/>
-            </w:tcMar>
-          </w:tcPr>
-          <w:p>
-            <w:pPr>
-              <w:keepNext w:val="false"/>
-              <w:spacing w:after="0" w:line="240"/>
-            </w:pPr>
-            <w:r>
-              <w:rPr>
-                <w:rFonts w:ascii="Times New Roman" w:cs="Times New Roman" w:eastAsia="Times New Roman" w:hAnsi="Times New Roman"/>
-                <w:sz w:val="22"/>
-                <w:szCs w:val="22"/>
-              </w:rPr>
-              <w:t xml:space="preserve">Now admitted; tender</w:t>
+            <w:tcW w:type="dxa" w:w="1698"/>
+            <w:tcBorders>
+              <w:top w:val="single" w:color="D9D9D9" w:sz="4"/>
+              <w:left w:val="single" w:color="D9D9D9" w:sz="4"/>
+              <w:bottom w:val="single" w:color="D9D9D9" w:sz="4"/>
+              <w:right w:val="single" w:color="D9D9D9" w:sz="4"/>
+            </w:tcBorders>
+            <w:tcMar>
+              <w:top w:type="dxa" w:w="70"/>
+              <w:left w:type="dxa" w:w="80"/>
+              <w:bottom w:type="dxa" w:w="70"/>
+              <w:right w:type="dxa" w:w="80"/>
+            </w:tcMar>
+          </w:tcPr>
+          <w:p>
+            <w:pPr>
+              <w:keepNext w:val="false"/>
+              <w:spacing w:after="0" w:line="240"/>
+            </w:pPr>
+            <w:r>
+              <w:rPr>
+                <w:rFonts w:ascii="Times New Roman" w:cs="Times New Roman" w:eastAsia="Times New Roman" w:hAnsi="Times New Roman"/>
+                <w:sz w:val="22"/>
+                <w:szCs w:val="22"/>
+              </w:rPr>
+              <w:t xml:space="preserve">Veracity confirmed; tender proposed</w:t>
             </w:r>
           </w:p>
         </w:tc>
@@ -7130,7 +7130,7 @@
         </w:tc>
         <w:tc>
           <w:tcPr>
-            <w:tcW w:type="dxa" w:w="2400"/>
+            <w:tcW w:type="dxa" w:w="2340"/>
             <w:tcBorders>
               <w:top w:val="single" w:color="D9D9D9" w:sz="4"/>
               <w:left w:val="single" w:color="D9D9D9" w:sz="4"/>
@@ -7223,7 +7223,7 @@
         </w:tc>
         <w:tc>
           <w:tcPr>
-            <w:tcW w:type="dxa" w:w="1560"/>
+            <w:tcW w:type="dxa" w:w="1540"/>
             <w:tcBorders>
               <w:top w:val="single" w:color="D9D9D9" w:sz="4"/>
               <w:left w:val="single" w:color="D9D9D9" w:sz="4"/>
@@ -7254,7 +7254,7 @@
         </w:tc>
         <w:tc>
           <w:tcPr>
-            <w:tcW w:type="dxa" w:w="1440"/>
+            <w:tcW w:type="dxa" w:w="1300"/>
             <w:tcBorders>
               <w:top w:val="single" w:color="D9D9D9" w:sz="4"/>
               <w:left w:val="single" w:color="D9D9D9" w:sz="4"/>
@@ -7285,32 +7285,32 @@
         </w:tc>
         <w:tc>
           <w:tcPr>
-            <w:tcW w:type="dxa" w:w="1478"/>
-            <w:tcBorders>
-              <w:top w:val="single" w:color="D9D9D9" w:sz="4"/>
-              <w:left w:val="single" w:color="D9D9D9" w:sz="4"/>
-              <w:bottom w:val="single" w:color="D9D9D9" w:sz="4"/>
-              <w:right w:val="single" w:color="D9D9D9" w:sz="4"/>
-            </w:tcBorders>
-            <w:tcMar>
-              <w:top w:type="dxa" w:w="70"/>
-              <w:left w:type="dxa" w:w="80"/>
-              <w:bottom w:type="dxa" w:w="70"/>
-              <w:right w:type="dxa" w:w="80"/>
-            </w:tcMar>
-          </w:tcPr>
-          <w:p>
-            <w:pPr>
-              <w:keepNext w:val="false"/>
-              <w:spacing w:after="0" w:line="240"/>
-            </w:pPr>
-            <w:r>
-              <w:rPr>
-                <w:rFonts w:ascii="Times New Roman" w:cs="Times New Roman" w:eastAsia="Times New Roman" w:hAnsi="Times New Roman"/>
-                <w:sz w:val="22"/>
-                <w:szCs w:val="22"/>
-              </w:rPr>
-              <w:t xml:space="preserve">Now admitted; tender</w:t>
+            <w:tcW w:type="dxa" w:w="1698"/>
+            <w:tcBorders>
+              <w:top w:val="single" w:color="D9D9D9" w:sz="4"/>
+              <w:left w:val="single" w:color="D9D9D9" w:sz="4"/>
+              <w:bottom w:val="single" w:color="D9D9D9" w:sz="4"/>
+              <w:right w:val="single" w:color="D9D9D9" w:sz="4"/>
+            </w:tcBorders>
+            <w:tcMar>
+              <w:top w:type="dxa" w:w="70"/>
+              <w:left w:type="dxa" w:w="80"/>
+              <w:bottom w:type="dxa" w:w="70"/>
+              <w:right w:type="dxa" w:w="80"/>
+            </w:tcMar>
+          </w:tcPr>
+          <w:p>
+            <w:pPr>
+              <w:keepNext w:val="false"/>
+              <w:spacing w:after="0" w:line="240"/>
+            </w:pPr>
+            <w:r>
+              <w:rPr>
+                <w:rFonts w:ascii="Times New Roman" w:cs="Times New Roman" w:eastAsia="Times New Roman" w:hAnsi="Times New Roman"/>
+                <w:sz w:val="22"/>
+                <w:szCs w:val="22"/>
+              </w:rPr>
+              <w:t xml:space="preserve">Veracity confirmed; tender proposed</w:t>
             </w:r>
           </w:p>
         </w:tc>
@@ -7353,7 +7353,7 @@
         </w:tc>
         <w:tc>
           <w:tcPr>
-            <w:tcW w:type="dxa" w:w="2400"/>
+            <w:tcW w:type="dxa" w:w="2340"/>
             <w:tcBorders>
               <w:top w:val="single" w:color="D9D9D9" w:sz="4"/>
               <w:left w:val="single" w:color="D9D9D9" w:sz="4"/>
@@ -7446,7 +7446,7 @@
         </w:tc>
         <w:tc>
           <w:tcPr>
-            <w:tcW w:type="dxa" w:w="1560"/>
+            <w:tcW w:type="dxa" w:w="1540"/>
             <w:tcBorders>
               <w:top w:val="single" w:color="D9D9D9" w:sz="4"/>
               <w:left w:val="single" w:color="D9D9D9" w:sz="4"/>
@@ -7477,7 +7477,7 @@
         </w:tc>
         <w:tc>
           <w:tcPr>
-            <w:tcW w:type="dxa" w:w="1440"/>
+            <w:tcW w:type="dxa" w:w="1300"/>
             <w:tcBorders>
               <w:top w:val="single" w:color="D9D9D9" w:sz="4"/>
               <w:left w:val="single" w:color="D9D9D9" w:sz="4"/>
@@ -7508,32 +7508,32 @@
         </w:tc>
         <w:tc>
           <w:tcPr>
-            <w:tcW w:type="dxa" w:w="1478"/>
-            <w:tcBorders>
-              <w:top w:val="single" w:color="D9D9D9" w:sz="4"/>
-              <w:left w:val="single" w:color="D9D9D9" w:sz="4"/>
-              <w:bottom w:val="single" w:color="D9D9D9" w:sz="4"/>
-              <w:right w:val="single" w:color="D9D9D9" w:sz="4"/>
-            </w:tcBorders>
-            <w:tcMar>
-              <w:top w:type="dxa" w:w="70"/>
-              <w:left w:type="dxa" w:w="80"/>
-              <w:bottom w:type="dxa" w:w="70"/>
-              <w:right w:type="dxa" w:w="80"/>
-            </w:tcMar>
-          </w:tcPr>
-          <w:p>
-            <w:pPr>
-              <w:keepNext w:val="false"/>
-              <w:spacing w:after="0" w:line="240"/>
-            </w:pPr>
-            <w:r>
-              <w:rPr>
-                <w:rFonts w:ascii="Times New Roman" w:cs="Times New Roman" w:eastAsia="Times New Roman" w:hAnsi="Times New Roman"/>
-                <w:sz w:val="22"/>
-                <w:szCs w:val="22"/>
-              </w:rPr>
-              <w:t xml:space="preserve">Now admitted; tender</w:t>
+            <w:tcW w:type="dxa" w:w="1698"/>
+            <w:tcBorders>
+              <w:top w:val="single" w:color="D9D9D9" w:sz="4"/>
+              <w:left w:val="single" w:color="D9D9D9" w:sz="4"/>
+              <w:bottom w:val="single" w:color="D9D9D9" w:sz="4"/>
+              <w:right w:val="single" w:color="D9D9D9" w:sz="4"/>
+            </w:tcBorders>
+            <w:tcMar>
+              <w:top w:type="dxa" w:w="70"/>
+              <w:left w:type="dxa" w:w="80"/>
+              <w:bottom w:type="dxa" w:w="70"/>
+              <w:right w:type="dxa" w:w="80"/>
+            </w:tcMar>
+          </w:tcPr>
+          <w:p>
+            <w:pPr>
+              <w:keepNext w:val="false"/>
+              <w:spacing w:after="0" w:line="240"/>
+            </w:pPr>
+            <w:r>
+              <w:rPr>
+                <w:rFonts w:ascii="Times New Roman" w:cs="Times New Roman" w:eastAsia="Times New Roman" w:hAnsi="Times New Roman"/>
+                <w:sz w:val="22"/>
+                <w:szCs w:val="22"/>
+              </w:rPr>
+              <w:t xml:space="preserve">Veracity confirmed; tender proposed</w:t>
             </w:r>
           </w:p>
         </w:tc>
@@ -7576,7 +7576,7 @@
         </w:tc>
         <w:tc>
           <w:tcPr>
-            <w:tcW w:type="dxa" w:w="2400"/>
+            <w:tcW w:type="dxa" w:w="2340"/>
             <w:tcBorders>
               <w:top w:val="single" w:color="D9D9D9" w:sz="4"/>
               <w:left w:val="single" w:color="D9D9D9" w:sz="4"/>
@@ -7669,7 +7669,7 @@
         </w:tc>
         <w:tc>
           <w:tcPr>
-            <w:tcW w:type="dxa" w:w="1560"/>
+            <w:tcW w:type="dxa" w:w="1540"/>
             <w:tcBorders>
               <w:top w:val="single" w:color="D9D9D9" w:sz="4"/>
               <w:left w:val="single" w:color="D9D9D9" w:sz="4"/>
@@ -7700,7 +7700,7 @@
         </w:tc>
         <w:tc>
           <w:tcPr>
-            <w:tcW w:type="dxa" w:w="1440"/>
+            <w:tcW w:type="dxa" w:w="1300"/>
             <w:tcBorders>
               <w:top w:val="single" w:color="D9D9D9" w:sz="4"/>
               <w:left w:val="single" w:color="D9D9D9" w:sz="4"/>
@@ -7731,32 +7731,32 @@
         </w:tc>
         <w:tc>
           <w:tcPr>
-            <w:tcW w:type="dxa" w:w="1478"/>
-            <w:tcBorders>
-              <w:top w:val="single" w:color="D9D9D9" w:sz="4"/>
-              <w:left w:val="single" w:color="D9D9D9" w:sz="4"/>
-              <w:bottom w:val="single" w:color="D9D9D9" w:sz="4"/>
-              <w:right w:val="single" w:color="D9D9D9" w:sz="4"/>
-            </w:tcBorders>
-            <w:tcMar>
-              <w:top w:type="dxa" w:w="70"/>
-              <w:left w:type="dxa" w:w="80"/>
-              <w:bottom w:type="dxa" w:w="70"/>
-              <w:right w:type="dxa" w:w="80"/>
-            </w:tcMar>
-          </w:tcPr>
-          <w:p>
-            <w:pPr>
-              <w:keepNext w:val="false"/>
-              <w:spacing w:after="0" w:line="240"/>
-            </w:pPr>
-            <w:r>
-              <w:rPr>
-                <w:rFonts w:ascii="Times New Roman" w:cs="Times New Roman" w:eastAsia="Times New Roman" w:hAnsi="Times New Roman"/>
-                <w:sz w:val="22"/>
-                <w:szCs w:val="22"/>
-              </w:rPr>
-              <w:t xml:space="preserve">Now admitted; tender</w:t>
+            <w:tcW w:type="dxa" w:w="1698"/>
+            <w:tcBorders>
+              <w:top w:val="single" w:color="D9D9D9" w:sz="4"/>
+              <w:left w:val="single" w:color="D9D9D9" w:sz="4"/>
+              <w:bottom w:val="single" w:color="D9D9D9" w:sz="4"/>
+              <w:right w:val="single" w:color="D9D9D9" w:sz="4"/>
+            </w:tcBorders>
+            <w:tcMar>
+              <w:top w:type="dxa" w:w="70"/>
+              <w:left w:type="dxa" w:w="80"/>
+              <w:bottom w:type="dxa" w:w="70"/>
+              <w:right w:type="dxa" w:w="80"/>
+            </w:tcMar>
+          </w:tcPr>
+          <w:p>
+            <w:pPr>
+              <w:keepNext w:val="false"/>
+              <w:spacing w:after="0" w:line="240"/>
+            </w:pPr>
+            <w:r>
+              <w:rPr>
+                <w:rFonts w:ascii="Times New Roman" w:cs="Times New Roman" w:eastAsia="Times New Roman" w:hAnsi="Times New Roman"/>
+                <w:sz w:val="22"/>
+                <w:szCs w:val="22"/>
+              </w:rPr>
+              <w:t xml:space="preserve">Veracity confirmed; tender proposed</w:t>
             </w:r>
           </w:p>
         </w:tc>
@@ -7799,7 +7799,7 @@
         </w:tc>
         <w:tc>
           <w:tcPr>
-            <w:tcW w:type="dxa" w:w="2400"/>
+            <w:tcW w:type="dxa" w:w="2340"/>
             <w:tcBorders>
               <w:top w:val="single" w:color="D9D9D9" w:sz="4"/>
               <w:left w:val="single" w:color="D9D9D9" w:sz="4"/>
@@ -7892,7 +7892,7 @@
         </w:tc>
         <w:tc>
           <w:tcPr>
-            <w:tcW w:type="dxa" w:w="1560"/>
+            <w:tcW w:type="dxa" w:w="1540"/>
             <w:tcBorders>
               <w:top w:val="single" w:color="D9D9D9" w:sz="4"/>
               <w:left w:val="single" w:color="D9D9D9" w:sz="4"/>
@@ -7923,7 +7923,7 @@
         </w:tc>
         <w:tc>
           <w:tcPr>
-            <w:tcW w:type="dxa" w:w="1440"/>
+            <w:tcW w:type="dxa" w:w="1300"/>
             <w:tcBorders>
               <w:top w:val="single" w:color="D9D9D9" w:sz="4"/>
               <w:left w:val="single" w:color="D9D9D9" w:sz="4"/>
@@ -7954,32 +7954,32 @@
         </w:tc>
         <w:tc>
           <w:tcPr>
-            <w:tcW w:type="dxa" w:w="1478"/>
-            <w:tcBorders>
-              <w:top w:val="single" w:color="D9D9D9" w:sz="4"/>
-              <w:left w:val="single" w:color="D9D9D9" w:sz="4"/>
-              <w:bottom w:val="single" w:color="D9D9D9" w:sz="4"/>
-              <w:right w:val="single" w:color="D9D9D9" w:sz="4"/>
-            </w:tcBorders>
-            <w:tcMar>
-              <w:top w:type="dxa" w:w="70"/>
-              <w:left w:type="dxa" w:w="80"/>
-              <w:bottom w:type="dxa" w:w="70"/>
-              <w:right w:type="dxa" w:w="80"/>
-            </w:tcMar>
-          </w:tcPr>
-          <w:p>
-            <w:pPr>
-              <w:keepNext w:val="false"/>
-              <w:spacing w:after="0" w:line="240"/>
-            </w:pPr>
-            <w:r>
-              <w:rPr>
-                <w:rFonts w:ascii="Times New Roman" w:cs="Times New Roman" w:eastAsia="Times New Roman" w:hAnsi="Times New Roman"/>
-                <w:sz w:val="22"/>
-                <w:szCs w:val="22"/>
-              </w:rPr>
-              <w:t xml:space="preserve">Now admitted; tender</w:t>
+            <w:tcW w:type="dxa" w:w="1698"/>
+            <w:tcBorders>
+              <w:top w:val="single" w:color="D9D9D9" w:sz="4"/>
+              <w:left w:val="single" w:color="D9D9D9" w:sz="4"/>
+              <w:bottom w:val="single" w:color="D9D9D9" w:sz="4"/>
+              <w:right w:val="single" w:color="D9D9D9" w:sz="4"/>
+            </w:tcBorders>
+            <w:tcMar>
+              <w:top w:type="dxa" w:w="70"/>
+              <w:left w:type="dxa" w:w="80"/>
+              <w:bottom w:type="dxa" w:w="70"/>
+              <w:right w:type="dxa" w:w="80"/>
+            </w:tcMar>
+          </w:tcPr>
+          <w:p>
+            <w:pPr>
+              <w:keepNext w:val="false"/>
+              <w:spacing w:after="0" w:line="240"/>
+            </w:pPr>
+            <w:r>
+              <w:rPr>
+                <w:rFonts w:ascii="Times New Roman" w:cs="Times New Roman" w:eastAsia="Times New Roman" w:hAnsi="Times New Roman"/>
+                <w:sz w:val="22"/>
+                <w:szCs w:val="22"/>
+              </w:rPr>
+              <w:t xml:space="preserve">Veracity confirmed; tender proposed</w:t>
             </w:r>
           </w:p>
         </w:tc>
@@ -8022,7 +8022,7 @@
         </w:tc>
         <w:tc>
           <w:tcPr>
-            <w:tcW w:type="dxa" w:w="2400"/>
+            <w:tcW w:type="dxa" w:w="2340"/>
             <w:tcBorders>
               <w:top w:val="single" w:color="D9D9D9" w:sz="4"/>
               <w:left w:val="single" w:color="D9D9D9" w:sz="4"/>
@@ -8115,7 +8115,7 @@
         </w:tc>
         <w:tc>
           <w:tcPr>
-            <w:tcW w:type="dxa" w:w="1560"/>
+            <w:tcW w:type="dxa" w:w="1540"/>
             <w:tcBorders>
               <w:top w:val="single" w:color="D9D9D9" w:sz="4"/>
               <w:left w:val="single" w:color="D9D9D9" w:sz="4"/>
@@ -8146,7 +8146,7 @@
         </w:tc>
         <w:tc>
           <w:tcPr>
-            <w:tcW w:type="dxa" w:w="1440"/>
+            <w:tcW w:type="dxa" w:w="1300"/>
             <w:tcBorders>
               <w:top w:val="single" w:color="D9D9D9" w:sz="4"/>
               <w:left w:val="single" w:color="D9D9D9" w:sz="4"/>
@@ -8177,32 +8177,32 @@
         </w:tc>
         <w:tc>
           <w:tcPr>
-            <w:tcW w:type="dxa" w:w="1478"/>
-            <w:tcBorders>
-              <w:top w:val="single" w:color="D9D9D9" w:sz="4"/>
-              <w:left w:val="single" w:color="D9D9D9" w:sz="4"/>
-              <w:bottom w:val="single" w:color="D9D9D9" w:sz="4"/>
-              <w:right w:val="single" w:color="D9D9D9" w:sz="4"/>
-            </w:tcBorders>
-            <w:tcMar>
-              <w:top w:type="dxa" w:w="70"/>
-              <w:left w:type="dxa" w:w="80"/>
-              <w:bottom w:type="dxa" w:w="70"/>
-              <w:right w:type="dxa" w:w="80"/>
-            </w:tcMar>
-          </w:tcPr>
-          <w:p>
-            <w:pPr>
-              <w:keepNext w:val="false"/>
-              <w:spacing w:after="0" w:line="240"/>
-            </w:pPr>
-            <w:r>
-              <w:rPr>
-                <w:rFonts w:ascii="Times New Roman" w:cs="Times New Roman" w:eastAsia="Times New Roman" w:hAnsi="Times New Roman"/>
-                <w:sz w:val="22"/>
-                <w:szCs w:val="22"/>
-              </w:rPr>
-              <w:t xml:space="preserve">Now admitted; tender</w:t>
+            <w:tcW w:type="dxa" w:w="1698"/>
+            <w:tcBorders>
+              <w:top w:val="single" w:color="D9D9D9" w:sz="4"/>
+              <w:left w:val="single" w:color="D9D9D9" w:sz="4"/>
+              <w:bottom w:val="single" w:color="D9D9D9" w:sz="4"/>
+              <w:right w:val="single" w:color="D9D9D9" w:sz="4"/>
+            </w:tcBorders>
+            <w:tcMar>
+              <w:top w:type="dxa" w:w="70"/>
+              <w:left w:type="dxa" w:w="80"/>
+              <w:bottom w:type="dxa" w:w="70"/>
+              <w:right w:type="dxa" w:w="80"/>
+            </w:tcMar>
+          </w:tcPr>
+          <w:p>
+            <w:pPr>
+              <w:keepNext w:val="false"/>
+              <w:spacing w:after="0" w:line="240"/>
+            </w:pPr>
+            <w:r>
+              <w:rPr>
+                <w:rFonts w:ascii="Times New Roman" w:cs="Times New Roman" w:eastAsia="Times New Roman" w:hAnsi="Times New Roman"/>
+                <w:sz w:val="22"/>
+                <w:szCs w:val="22"/>
+              </w:rPr>
+              <w:t xml:space="preserve">Veracity confirmed; tender proposed</w:t>
             </w:r>
           </w:p>
         </w:tc>
@@ -8245,7 +8245,7 @@
         </w:tc>
         <w:tc>
           <w:tcPr>
-            <w:tcW w:type="dxa" w:w="2400"/>
+            <w:tcW w:type="dxa" w:w="2340"/>
             <w:tcBorders>
               <w:top w:val="single" w:color="D9D9D9" w:sz="4"/>
               <w:left w:val="single" w:color="D9D9D9" w:sz="4"/>
@@ -8338,7 +8338,7 @@
         </w:tc>
         <w:tc>
           <w:tcPr>
-            <w:tcW w:type="dxa" w:w="1560"/>
+            <w:tcW w:type="dxa" w:w="1540"/>
             <w:tcBorders>
               <w:top w:val="single" w:color="D9D9D9" w:sz="4"/>
               <w:left w:val="single" w:color="D9D9D9" w:sz="4"/>
@@ -8369,7 +8369,7 @@
         </w:tc>
         <w:tc>
           <w:tcPr>
-            <w:tcW w:type="dxa" w:w="1440"/>
+            <w:tcW w:type="dxa" w:w="1300"/>
             <w:tcBorders>
               <w:top w:val="single" w:color="D9D9D9" w:sz="4"/>
               <w:left w:val="single" w:color="D9D9D9" w:sz="4"/>
@@ -8400,32 +8400,32 @@
         </w:tc>
         <w:tc>
           <w:tcPr>
-            <w:tcW w:type="dxa" w:w="1478"/>
-            <w:tcBorders>
-              <w:top w:val="single" w:color="D9D9D9" w:sz="4"/>
-              <w:left w:val="single" w:color="D9D9D9" w:sz="4"/>
-              <w:bottom w:val="single" w:color="D9D9D9" w:sz="4"/>
-              <w:right w:val="single" w:color="D9D9D9" w:sz="4"/>
-            </w:tcBorders>
-            <w:tcMar>
-              <w:top w:type="dxa" w:w="70"/>
-              <w:left w:type="dxa" w:w="80"/>
-              <w:bottom w:type="dxa" w:w="70"/>
-              <w:right w:type="dxa" w:w="80"/>
-            </w:tcMar>
-          </w:tcPr>
-          <w:p>
-            <w:pPr>
-              <w:keepNext w:val="false"/>
-              <w:spacing w:after="0" w:line="240"/>
-            </w:pPr>
-            <w:r>
-              <w:rPr>
-                <w:rFonts w:ascii="Times New Roman" w:cs="Times New Roman" w:eastAsia="Times New Roman" w:hAnsi="Times New Roman"/>
-                <w:sz w:val="22"/>
-                <w:szCs w:val="22"/>
-              </w:rPr>
-              <w:t xml:space="preserve">Now admitted; tender</w:t>
+            <w:tcW w:type="dxa" w:w="1698"/>
+            <w:tcBorders>
+              <w:top w:val="single" w:color="D9D9D9" w:sz="4"/>
+              <w:left w:val="single" w:color="D9D9D9" w:sz="4"/>
+              <w:bottom w:val="single" w:color="D9D9D9" w:sz="4"/>
+              <w:right w:val="single" w:color="D9D9D9" w:sz="4"/>
+            </w:tcBorders>
+            <w:tcMar>
+              <w:top w:type="dxa" w:w="70"/>
+              <w:left w:type="dxa" w:w="80"/>
+              <w:bottom w:type="dxa" w:w="70"/>
+              <w:right w:type="dxa" w:w="80"/>
+            </w:tcMar>
+          </w:tcPr>
+          <w:p>
+            <w:pPr>
+              <w:keepNext w:val="false"/>
+              <w:spacing w:after="0" w:line="240"/>
+            </w:pPr>
+            <w:r>
+              <w:rPr>
+                <w:rFonts w:ascii="Times New Roman" w:cs="Times New Roman" w:eastAsia="Times New Roman" w:hAnsi="Times New Roman"/>
+                <w:sz w:val="22"/>
+                <w:szCs w:val="22"/>
+              </w:rPr>
+              <w:t xml:space="preserve">Veracity confirmed; tender proposed</w:t>
             </w:r>
           </w:p>
         </w:tc>
@@ -8468,7 +8468,7 @@
         </w:tc>
         <w:tc>
           <w:tcPr>
-            <w:tcW w:type="dxa" w:w="2400"/>
+            <w:tcW w:type="dxa" w:w="2340"/>
             <w:tcBorders>
               <w:top w:val="single" w:color="D9D9D9" w:sz="4"/>
               <w:left w:val="single" w:color="D9D9D9" w:sz="4"/>
@@ -8561,7 +8561,7 @@
         </w:tc>
         <w:tc>
           <w:tcPr>
-            <w:tcW w:type="dxa" w:w="1560"/>
+            <w:tcW w:type="dxa" w:w="1540"/>
             <w:tcBorders>
               <w:top w:val="single" w:color="D9D9D9" w:sz="4"/>
               <w:left w:val="single" w:color="D9D9D9" w:sz="4"/>
@@ -8592,7 +8592,7 @@
         </w:tc>
         <w:tc>
           <w:tcPr>
-            <w:tcW w:type="dxa" w:w="1440"/>
+            <w:tcW w:type="dxa" w:w="1300"/>
             <w:tcBorders>
               <w:top w:val="single" w:color="D9D9D9" w:sz="4"/>
               <w:left w:val="single" w:color="D9D9D9" w:sz="4"/>
@@ -8623,32 +8623,32 @@
         </w:tc>
         <w:tc>
           <w:tcPr>
-            <w:tcW w:type="dxa" w:w="1478"/>
-            <w:tcBorders>
-              <w:top w:val="single" w:color="D9D9D9" w:sz="4"/>
-              <w:left w:val="single" w:color="D9D9D9" w:sz="4"/>
-              <w:bottom w:val="single" w:color="D9D9D9" w:sz="4"/>
-              <w:right w:val="single" w:color="D9D9D9" w:sz="4"/>
-            </w:tcBorders>
-            <w:tcMar>
-              <w:top w:type="dxa" w:w="70"/>
-              <w:left w:type="dxa" w:w="80"/>
-              <w:bottom w:type="dxa" w:w="70"/>
-              <w:right w:type="dxa" w:w="80"/>
-            </w:tcMar>
-          </w:tcPr>
-          <w:p>
-            <w:pPr>
-              <w:keepNext w:val="false"/>
-              <w:spacing w:after="0" w:line="240"/>
-            </w:pPr>
-            <w:r>
-              <w:rPr>
-                <w:rFonts w:ascii="Times New Roman" w:cs="Times New Roman" w:eastAsia="Times New Roman" w:hAnsi="Times New Roman"/>
-                <w:sz w:val="22"/>
-                <w:szCs w:val="22"/>
-              </w:rPr>
-              <w:t xml:space="preserve">Now admitted; tender</w:t>
+            <w:tcW w:type="dxa" w:w="1698"/>
+            <w:tcBorders>
+              <w:top w:val="single" w:color="D9D9D9" w:sz="4"/>
+              <w:left w:val="single" w:color="D9D9D9" w:sz="4"/>
+              <w:bottom w:val="single" w:color="D9D9D9" w:sz="4"/>
+              <w:right w:val="single" w:color="D9D9D9" w:sz="4"/>
+            </w:tcBorders>
+            <w:tcMar>
+              <w:top w:type="dxa" w:w="70"/>
+              <w:left w:type="dxa" w:w="80"/>
+              <w:bottom w:type="dxa" w:w="70"/>
+              <w:right w:type="dxa" w:w="80"/>
+            </w:tcMar>
+          </w:tcPr>
+          <w:p>
+            <w:pPr>
+              <w:keepNext w:val="false"/>
+              <w:spacing w:after="0" w:line="240"/>
+            </w:pPr>
+            <w:r>
+              <w:rPr>
+                <w:rFonts w:ascii="Times New Roman" w:cs="Times New Roman" w:eastAsia="Times New Roman" w:hAnsi="Times New Roman"/>
+                <w:sz w:val="22"/>
+                <w:szCs w:val="22"/>
+              </w:rPr>
+              <w:t xml:space="preserve">Veracity confirmed; tender proposed</w:t>
             </w:r>
           </w:p>
         </w:tc>
@@ -8691,7 +8691,7 @@
         </w:tc>
         <w:tc>
           <w:tcPr>
-            <w:tcW w:type="dxa" w:w="2400"/>
+            <w:tcW w:type="dxa" w:w="2340"/>
             <w:tcBorders>
               <w:top w:val="single" w:color="D9D9D9" w:sz="4"/>
               <w:left w:val="single" w:color="D9D9D9" w:sz="4"/>
@@ -8784,7 +8784,7 @@
         </w:tc>
         <w:tc>
           <w:tcPr>
-            <w:tcW w:type="dxa" w:w="1560"/>
+            <w:tcW w:type="dxa" w:w="1540"/>
             <w:tcBorders>
               <w:top w:val="single" w:color="D9D9D9" w:sz="4"/>
               <w:left w:val="single" w:color="D9D9D9" w:sz="4"/>
@@ -8815,7 +8815,7 @@
         </w:tc>
         <w:tc>
           <w:tcPr>
-            <w:tcW w:type="dxa" w:w="1440"/>
+            <w:tcW w:type="dxa" w:w="1300"/>
             <w:tcBorders>
               <w:top w:val="single" w:color="D9D9D9" w:sz="4"/>
               <w:left w:val="single" w:color="D9D9D9" w:sz="4"/>
@@ -8846,32 +8846,32 @@
         </w:tc>
         <w:tc>
           <w:tcPr>
-            <w:tcW w:type="dxa" w:w="1478"/>
-            <w:tcBorders>
-              <w:top w:val="single" w:color="D9D9D9" w:sz="4"/>
-              <w:left w:val="single" w:color="D9D9D9" w:sz="4"/>
-              <w:bottom w:val="single" w:color="D9D9D9" w:sz="4"/>
-              <w:right w:val="single" w:color="D9D9D9" w:sz="4"/>
-            </w:tcBorders>
-            <w:tcMar>
-              <w:top w:type="dxa" w:w="70"/>
-              <w:left w:type="dxa" w:w="80"/>
-              <w:bottom w:type="dxa" w:w="70"/>
-              <w:right w:type="dxa" w:w="80"/>
-            </w:tcMar>
-          </w:tcPr>
-          <w:p>
-            <w:pPr>
-              <w:keepNext w:val="false"/>
-              <w:spacing w:after="0" w:line="240"/>
-            </w:pPr>
-            <w:r>
-              <w:rPr>
-                <w:rFonts w:ascii="Times New Roman" w:cs="Times New Roman" w:eastAsia="Times New Roman" w:hAnsi="Times New Roman"/>
-                <w:sz w:val="22"/>
-                <w:szCs w:val="22"/>
-              </w:rPr>
-              <w:t xml:space="preserve">Now admitted; tender</w:t>
+            <w:tcW w:type="dxa" w:w="1698"/>
+            <w:tcBorders>
+              <w:top w:val="single" w:color="D9D9D9" w:sz="4"/>
+              <w:left w:val="single" w:color="D9D9D9" w:sz="4"/>
+              <w:bottom w:val="single" w:color="D9D9D9" w:sz="4"/>
+              <w:right w:val="single" w:color="D9D9D9" w:sz="4"/>
+            </w:tcBorders>
+            <w:tcMar>
+              <w:top w:type="dxa" w:w="70"/>
+              <w:left w:type="dxa" w:w="80"/>
+              <w:bottom w:type="dxa" w:w="70"/>
+              <w:right w:type="dxa" w:w="80"/>
+            </w:tcMar>
+          </w:tcPr>
+          <w:p>
+            <w:pPr>
+              <w:keepNext w:val="false"/>
+              <w:spacing w:after="0" w:line="240"/>
+            </w:pPr>
+            <w:r>
+              <w:rPr>
+                <w:rFonts w:ascii="Times New Roman" w:cs="Times New Roman" w:eastAsia="Times New Roman" w:hAnsi="Times New Roman"/>
+                <w:sz w:val="22"/>
+                <w:szCs w:val="22"/>
+              </w:rPr>
+              <w:t xml:space="preserve">Veracity confirmed; tender proposed</w:t>
             </w:r>
           </w:p>
         </w:tc>
@@ -8914,7 +8914,7 @@
         </w:tc>
         <w:tc>
           <w:tcPr>
-            <w:tcW w:type="dxa" w:w="2400"/>
+            <w:tcW w:type="dxa" w:w="2340"/>
             <w:tcBorders>
               <w:top w:val="single" w:color="D9D9D9" w:sz="4"/>
               <w:left w:val="single" w:color="D9D9D9" w:sz="4"/>
@@ -9007,7 +9007,7 @@
         </w:tc>
         <w:tc>
           <w:tcPr>
-            <w:tcW w:type="dxa" w:w="1560"/>
+            <w:tcW w:type="dxa" w:w="1540"/>
             <w:tcBorders>
               <w:top w:val="single" w:color="D9D9D9" w:sz="4"/>
               <w:left w:val="single" w:color="D9D9D9" w:sz="4"/>
@@ -9038,7 +9038,7 @@
         </w:tc>
         <w:tc>
           <w:tcPr>
-            <w:tcW w:type="dxa" w:w="1440"/>
+            <w:tcW w:type="dxa" w:w="1300"/>
             <w:tcBorders>
               <w:top w:val="single" w:color="D9D9D9" w:sz="4"/>
               <w:left w:val="single" w:color="D9D9D9" w:sz="4"/>
@@ -9069,32 +9069,32 @@
         </w:tc>
         <w:tc>
           <w:tcPr>
-            <w:tcW w:type="dxa" w:w="1478"/>
-            <w:tcBorders>
-              <w:top w:val="single" w:color="D9D9D9" w:sz="4"/>
-              <w:left w:val="single" w:color="D9D9D9" w:sz="4"/>
-              <w:bottom w:val="single" w:color="D9D9D9" w:sz="4"/>
-              <w:right w:val="single" w:color="D9D9D9" w:sz="4"/>
-            </w:tcBorders>
-            <w:tcMar>
-              <w:top w:type="dxa" w:w="70"/>
-              <w:left w:type="dxa" w:w="80"/>
-              <w:bottom w:type="dxa" w:w="70"/>
-              <w:right w:type="dxa" w:w="80"/>
-            </w:tcMar>
-          </w:tcPr>
-          <w:p>
-            <w:pPr>
-              <w:keepNext w:val="false"/>
-              <w:spacing w:after="0" w:line="240"/>
-            </w:pPr>
-            <w:r>
-              <w:rPr>
-                <w:rFonts w:ascii="Times New Roman" w:cs="Times New Roman" w:eastAsia="Times New Roman" w:hAnsi="Times New Roman"/>
-                <w:sz w:val="22"/>
-                <w:szCs w:val="22"/>
-              </w:rPr>
-              <w:t xml:space="preserve">Now admitted; tender</w:t>
+            <w:tcW w:type="dxa" w:w="1698"/>
+            <w:tcBorders>
+              <w:top w:val="single" w:color="D9D9D9" w:sz="4"/>
+              <w:left w:val="single" w:color="D9D9D9" w:sz="4"/>
+              <w:bottom w:val="single" w:color="D9D9D9" w:sz="4"/>
+              <w:right w:val="single" w:color="D9D9D9" w:sz="4"/>
+            </w:tcBorders>
+            <w:tcMar>
+              <w:top w:type="dxa" w:w="70"/>
+              <w:left w:type="dxa" w:w="80"/>
+              <w:bottom w:type="dxa" w:w="70"/>
+              <w:right w:type="dxa" w:w="80"/>
+            </w:tcMar>
+          </w:tcPr>
+          <w:p>
+            <w:pPr>
+              <w:keepNext w:val="false"/>
+              <w:spacing w:after="0" w:line="240"/>
+            </w:pPr>
+            <w:r>
+              <w:rPr>
+                <w:rFonts w:ascii="Times New Roman" w:cs="Times New Roman" w:eastAsia="Times New Roman" w:hAnsi="Times New Roman"/>
+                <w:sz w:val="22"/>
+                <w:szCs w:val="22"/>
+              </w:rPr>
+              <w:t xml:space="preserve">Veracity confirmed; tender proposed</w:t>
             </w:r>
           </w:p>
         </w:tc>
@@ -9137,7 +9137,7 @@
         </w:tc>
         <w:tc>
           <w:tcPr>
-            <w:tcW w:type="dxa" w:w="2400"/>
+            <w:tcW w:type="dxa" w:w="2340"/>
             <w:tcBorders>
               <w:top w:val="single" w:color="D9D9D9" w:sz="4"/>
               <w:left w:val="single" w:color="D9D9D9" w:sz="4"/>
@@ -9230,7 +9230,7 @@
         </w:tc>
         <w:tc>
           <w:tcPr>
-            <w:tcW w:type="dxa" w:w="1560"/>
+            <w:tcW w:type="dxa" w:w="1540"/>
             <w:tcBorders>
               <w:top w:val="single" w:color="D9D9D9" w:sz="4"/>
               <w:left w:val="single" w:color="D9D9D9" w:sz="4"/>
@@ -9261,7 +9261,7 @@
         </w:tc>
         <w:tc>
           <w:tcPr>
-            <w:tcW w:type="dxa" w:w="1440"/>
+            <w:tcW w:type="dxa" w:w="1300"/>
             <w:tcBorders>
               <w:top w:val="single" w:color="D9D9D9" w:sz="4"/>
               <w:left w:val="single" w:color="D9D9D9" w:sz="4"/>
@@ -9292,32 +9292,32 @@
         </w:tc>
         <w:tc>
           <w:tcPr>
-            <w:tcW w:type="dxa" w:w="1478"/>
-            <w:tcBorders>
-              <w:top w:val="single" w:color="D9D9D9" w:sz="4"/>
-              <w:left w:val="single" w:color="D9D9D9" w:sz="4"/>
-              <w:bottom w:val="single" w:color="D9D9D9" w:sz="4"/>
-              <w:right w:val="single" w:color="D9D9D9" w:sz="4"/>
-            </w:tcBorders>
-            <w:tcMar>
-              <w:top w:type="dxa" w:w="70"/>
-              <w:left w:type="dxa" w:w="80"/>
-              <w:bottom w:type="dxa" w:w="70"/>
-              <w:right w:type="dxa" w:w="80"/>
-            </w:tcMar>
-          </w:tcPr>
-          <w:p>
-            <w:pPr>
-              <w:keepNext w:val="false"/>
-              <w:spacing w:after="0" w:line="240"/>
-            </w:pPr>
-            <w:r>
-              <w:rPr>
-                <w:rFonts w:ascii="Times New Roman" w:cs="Times New Roman" w:eastAsia="Times New Roman" w:hAnsi="Times New Roman"/>
-                <w:sz w:val="22"/>
-                <w:szCs w:val="22"/>
-              </w:rPr>
-              <w:t xml:space="preserve">Spreadsheet confirmed; tender. Facts 228-231 not admitted (see the table after Part 1)</w:t>
+            <w:tcW w:type="dxa" w:w="1698"/>
+            <w:tcBorders>
+              <w:top w:val="single" w:color="D9D9D9" w:sz="4"/>
+              <w:left w:val="single" w:color="D9D9D9" w:sz="4"/>
+              <w:bottom w:val="single" w:color="D9D9D9" w:sz="4"/>
+              <w:right w:val="single" w:color="D9D9D9" w:sz="4"/>
+            </w:tcBorders>
+            <w:tcMar>
+              <w:top w:type="dxa" w:w="70"/>
+              <w:left w:type="dxa" w:w="80"/>
+              <w:bottom w:type="dxa" w:w="70"/>
+              <w:right w:type="dxa" w:w="80"/>
+            </w:tcMar>
+          </w:tcPr>
+          <w:p>
+            <w:pPr>
+              <w:keepNext w:val="false"/>
+              <w:spacing w:after="0" w:line="240"/>
+            </w:pPr>
+            <w:r>
+              <w:rPr>
+                <w:rFonts w:ascii="Times New Roman" w:cs="Times New Roman" w:eastAsia="Times New Roman" w:hAnsi="Times New Roman"/>
+                <w:sz w:val="22"/>
+                <w:szCs w:val="22"/>
+              </w:rPr>
+              <w:t xml:space="preserve">Veracity of the spreadsheet confirmed; tender proposed. Facts 228-231 not admitted (see the table after Part 1)</w:t>
             </w:r>
           </w:p>
         </w:tc>
@@ -9360,7 +9360,7 @@
         </w:tc>
         <w:tc>
           <w:tcPr>
-            <w:tcW w:type="dxa" w:w="2400"/>
+            <w:tcW w:type="dxa" w:w="2340"/>
             <w:tcBorders>
               <w:top w:val="single" w:color="D9D9D9" w:sz="4"/>
               <w:left w:val="single" w:color="D9D9D9" w:sz="4"/>
@@ -9453,7 +9453,7 @@
         </w:tc>
         <w:tc>
           <w:tcPr>
-            <w:tcW w:type="dxa" w:w="1560"/>
+            <w:tcW w:type="dxa" w:w="1540"/>
             <w:tcBorders>
               <w:top w:val="single" w:color="D9D9D9" w:sz="4"/>
               <w:left w:val="single" w:color="D9D9D9" w:sz="4"/>
@@ -9484,7 +9484,7 @@
         </w:tc>
         <w:tc>
           <w:tcPr>
-            <w:tcW w:type="dxa" w:w="1440"/>
+            <w:tcW w:type="dxa" w:w="1300"/>
             <w:tcBorders>
               <w:top w:val="single" w:color="D9D9D9" w:sz="4"/>
               <w:left w:val="single" w:color="D9D9D9" w:sz="4"/>
@@ -9515,7 +9515,7 @@
         </w:tc>
         <w:tc>
           <w:tcPr>
-            <w:tcW w:type="dxa" w:w="1478"/>
+            <w:tcW w:type="dxa" w:w="1698"/>
             <w:tcBorders>
               <w:top w:val="single" w:color="D9D9D9" w:sz="4"/>
               <w:left w:val="single" w:color="D9D9D9" w:sz="4"/>
@@ -9964,7 +9964,7 @@
                 <w:sz w:val="22"/>
                 <w:szCs w:val="22"/>
               </w:rPr>
-              <w:t xml:space="preserve">Admitted; tender</w:t>
+              <w:t xml:space="preserve">Veracity confirmed; tender proposed</w:t>
             </w:r>
           </w:p>
         </w:tc>
@@ -10125,7 +10125,7 @@
                 <w:sz w:val="22"/>
                 <w:szCs w:val="22"/>
               </w:rPr>
-              <w:t xml:space="preserve">Admitted (as Tab 29); tender</w:t>
+              <w:t xml:space="preserve">Admitted (as Tab 29); tender proposed</w:t>
             </w:r>
           </w:p>
         </w:tc>

</xml_diff>